<commit_message>
chore(demo): recaptura de la demo con la 1.20.0 (run 36288400380 sobre 57e1246, git_dirty=false) — informe legible, TTD puntuada y copy de la prueba SBA; run_id publicados movidos en deploy.yml
Co-Authored-By: Claude Opus 5.5 <noreply@anthropic.com>
</commit_message>
<xml_diff>
--- a/web/src/fixtures/demo/report-ifrs9.docx
+++ b/web/src/fixtures/demo/report-ifrs9.docx
@@ -163,7 +163,7 @@
           </w:tcPr>
           <w:p>
             <w:r>
-              <w:t>2026-09-22</w:t>
+              <w:t>2026-09-27</w:t>
             </w:r>
           </w:p>
         </w:tc>
@@ -199,7 +199,7 @@
         <w:rPr>
           <w:rFonts w:ascii="Consolas" w:hAnsi="Consolas"/>
         </w:rPr>
-        <w:t>git_sha=e77cc6a5d3c91915cd790d92cf8cad2930a04c81</w:t>
+        <w:t>git_sha=57e1246ee83b7f20a60ceee287bd73a2f62d64d6</w:t>
       </w:r>
     </w:p>
     <w:p>
@@ -785,6 +785,9 @@
             <w:tcW w:type="dxa" w:w="4320"/>
           </w:tcPr>
           <w:p>
+            <w:pPr>
+              <w:jc w:val="right"/>
+            </w:pPr>
             <w:r>
               <w:rPr>
                 <w:b/>
@@ -810,8 +813,11 @@
             <w:tcW w:type="dxa" w:w="4320"/>
           </w:tcPr>
           <w:p>
+            <w:pPr>
+              <w:jc w:val="right"/>
+            </w:pPr>
             <w:r>
-              <w:t>5422</w:t>
+              <w:t>5.422</w:t>
             </w:r>
           </w:p>
         </w:tc>
@@ -832,6 +838,9 @@
             <w:tcW w:type="dxa" w:w="4320"/>
           </w:tcPr>
           <w:p>
+            <w:pPr>
+              <w:jc w:val="right"/>
+            </w:pPr>
             <w:r>
               <w:t>578</w:t>
             </w:r>
@@ -854,6 +863,9 @@
             <w:tcW w:type="dxa" w:w="4320"/>
           </w:tcPr>
           <w:p>
+            <w:pPr>
+              <w:jc w:val="right"/>
+            </w:pPr>
             <w:r>
               <w:t>0</w:t>
             </w:r>
@@ -876,6 +888,9 @@
             <w:tcW w:type="dxa" w:w="4320"/>
           </w:tcPr>
           <w:p>
+            <w:pPr>
+              <w:jc w:val="right"/>
+            </w:pPr>
             <w:r>
               <w:t>0</w:t>
             </w:r>
@@ -922,6 +937,9 @@
             <w:tcW w:type="dxa" w:w="2880"/>
           </w:tcPr>
           <w:p>
+            <w:pPr>
+              <w:jc w:val="right"/>
+            </w:pPr>
             <w:r>
               <w:rPr>
                 <w:b/>
@@ -935,6 +953,9 @@
             <w:tcW w:type="dxa" w:w="2880"/>
           </w:tcPr>
           <w:p>
+            <w:pPr>
+              <w:jc w:val="right"/>
+            </w:pPr>
             <w:r>
               <w:rPr>
                 <w:b/>
@@ -951,7 +972,7 @@
           </w:tcPr>
           <w:p>
             <w:r>
-              <w:t>desarrollo</w:t>
+              <w:t>Desarrollo</w:t>
             </w:r>
           </w:p>
         </w:tc>
@@ -960,8 +981,11 @@
             <w:tcW w:type="dxa" w:w="2880"/>
           </w:tcPr>
           <w:p>
+            <w:pPr>
+              <w:jc w:val="right"/>
+            </w:pPr>
             <w:r>
-              <w:t>4024</w:t>
+              <w:t>4.024</w:t>
             </w:r>
           </w:p>
         </w:tc>
@@ -970,8 +994,11 @@
             <w:tcW w:type="dxa" w:w="2880"/>
           </w:tcPr>
           <w:p>
+            <w:pPr>
+              <w:jc w:val="right"/>
+            </w:pPr>
             <w:r>
-              <w:t>0.0964</w:t>
+              <w:t>0,0964</w:t>
             </w:r>
           </w:p>
         </w:tc>
@@ -983,7 +1010,7 @@
           </w:tcPr>
           <w:p>
             <w:r>
-              <w:t>holdout</w:t>
+              <w:t>Holdout</w:t>
             </w:r>
           </w:p>
         </w:tc>
@@ -992,8 +1019,11 @@
             <w:tcW w:type="dxa" w:w="2880"/>
           </w:tcPr>
           <w:p>
+            <w:pPr>
+              <w:jc w:val="right"/>
+            </w:pPr>
             <w:r>
-              <w:t>1030</w:t>
+              <w:t>1.030</w:t>
             </w:r>
           </w:p>
         </w:tc>
@@ -1002,8 +1032,11 @@
             <w:tcW w:type="dxa" w:w="2880"/>
           </w:tcPr>
           <w:p>
+            <w:pPr>
+              <w:jc w:val="right"/>
+            </w:pPr>
             <w:r>
-              <w:t>0.1000</w:t>
+              <w:t>0,1000</w:t>
             </w:r>
           </w:p>
         </w:tc>
@@ -1015,7 +1048,7 @@
           </w:tcPr>
           <w:p>
             <w:r>
-              <w:t>oot</w:t>
+              <w:t>Fuera de tiempo (OOT)</w:t>
             </w:r>
           </w:p>
         </w:tc>
@@ -1024,6 +1057,9 @@
             <w:tcW w:type="dxa" w:w="2880"/>
           </w:tcPr>
           <w:p>
+            <w:pPr>
+              <w:jc w:val="right"/>
+            </w:pPr>
             <w:r>
               <w:t>946</w:t>
             </w:r>
@@ -1034,8 +1070,11 @@
             <w:tcW w:type="dxa" w:w="2880"/>
           </w:tcPr>
           <w:p>
+            <w:pPr>
+              <w:jc w:val="right"/>
+            </w:pPr>
             <w:r>
-              <w:t>0.0920</w:t>
+              <w:t>0,09197</w:t>
             </w:r>
           </w:p>
         </w:tc>
@@ -1047,7 +1086,7 @@
           </w:tcPr>
           <w:p>
             <w:r>
-              <w:t>fuera_de_modelo</w:t>
+              <w:t>Fuera del ajuste</w:t>
             </w:r>
           </w:p>
         </w:tc>
@@ -1056,6 +1095,9 @@
             <w:tcW w:type="dxa" w:w="2880"/>
           </w:tcPr>
           <w:p>
+            <w:pPr>
+              <w:jc w:val="right"/>
+            </w:pPr>
             <w:r>
               <w:t>0</w:t>
             </w:r>
@@ -1066,8 +1108,11 @@
             <w:tcW w:type="dxa" w:w="2880"/>
           </w:tcPr>
           <w:p>
+            <w:pPr>
+              <w:jc w:val="right"/>
+            </w:pPr>
             <w:r>
-              <w:t>0.0000</w:t>
+              <w:t>0,0000</w:t>
             </w:r>
           </w:p>
         </w:tc>
@@ -1334,6 +1379,9 @@
             <w:tcW w:type="dxa" w:w="1234"/>
           </w:tcPr>
           <w:p>
+            <w:pPr>
+              <w:jc w:val="right"/>
+            </w:pPr>
             <w:r>
               <w:rPr>
                 <w:b/>
@@ -1360,6 +1408,9 @@
             <w:tcW w:type="dxa" w:w="1234"/>
           </w:tcPr>
           <w:p>
+            <w:pPr>
+              <w:jc w:val="right"/>
+            </w:pPr>
             <w:r>
               <w:rPr>
                 <w:b/>
@@ -1373,6 +1424,9 @@
             <w:tcW w:type="dxa" w:w="1234"/>
           </w:tcPr>
           <w:p>
+            <w:pPr>
+              <w:jc w:val="right"/>
+            </w:pPr>
             <w:r>
               <w:rPr>
                 <w:b/>
@@ -1386,6 +1440,9 @@
             <w:tcW w:type="dxa" w:w="1234"/>
           </w:tcPr>
           <w:p>
+            <w:pPr>
+              <w:jc w:val="right"/>
+            </w:pPr>
             <w:r>
               <w:rPr>
                 <w:b/>
@@ -1399,6 +1456,9 @@
             <w:tcW w:type="dxa" w:w="1234"/>
           </w:tcPr>
           <w:p>
+            <w:pPr>
+              <w:jc w:val="right"/>
+            </w:pPr>
             <w:r>
               <w:rPr>
                 <w:b/>
@@ -1424,6 +1484,9 @@
             <w:tcW w:type="dxa" w:w="1234"/>
           </w:tcPr>
           <w:p>
+            <w:pPr>
+              <w:jc w:val="right"/>
+            </w:pPr>
             <w:r>
               <w:t>1</w:t>
             </w:r>
@@ -1444,6 +1507,9 @@
             <w:tcW w:type="dxa" w:w="1234"/>
           </w:tcPr>
           <w:p>
+            <w:pPr>
+              <w:jc w:val="right"/>
+            </w:pPr>
             <w:r>
               <w:t>775</w:t>
             </w:r>
@@ -1454,8 +1520,11 @@
             <w:tcW w:type="dxa" w:w="1234"/>
           </w:tcPr>
           <w:p>
+            <w:pPr>
+              <w:jc w:val="right"/>
+            </w:pPr>
             <w:r>
-              <w:t>31178795.53</w:t>
+              <w:t>31.178.795,53</w:t>
             </w:r>
           </w:p>
         </w:tc>
@@ -1464,8 +1533,11 @@
             <w:tcW w:type="dxa" w:w="1234"/>
           </w:tcPr>
           <w:p>
+            <w:pPr>
+              <w:jc w:val="right"/>
+            </w:pPr>
             <w:r>
-              <w:t>581332.24</w:t>
+              <w:t>581.332,24</w:t>
             </w:r>
           </w:p>
         </w:tc>
@@ -1474,8 +1546,11 @@
             <w:tcW w:type="dxa" w:w="1234"/>
           </w:tcPr>
           <w:p>
+            <w:pPr>
+              <w:jc w:val="right"/>
+            </w:pPr>
             <w:r>
-              <w:t>0.018645</w:t>
+              <w:t>0,0186</w:t>
             </w:r>
           </w:p>
         </w:tc>
@@ -1496,6 +1571,9 @@
             <w:tcW w:type="dxa" w:w="1234"/>
           </w:tcPr>
           <w:p>
+            <w:pPr>
+              <w:jc w:val="right"/>
+            </w:pPr>
             <w:r>
               <w:t>2</w:t>
             </w:r>
@@ -1516,6 +1594,9 @@
             <w:tcW w:type="dxa" w:w="1234"/>
           </w:tcPr>
           <w:p>
+            <w:pPr>
+              <w:jc w:val="right"/>
+            </w:pPr>
             <w:r>
               <w:t>75</w:t>
             </w:r>
@@ -1526,8 +1607,11 @@
             <w:tcW w:type="dxa" w:w="1234"/>
           </w:tcPr>
           <w:p>
+            <w:pPr>
+              <w:jc w:val="right"/>
+            </w:pPr>
             <w:r>
-              <w:t>3137275.52</w:t>
+              <w:t>3.137.275,52</w:t>
             </w:r>
           </w:p>
         </w:tc>
@@ -1536,8 +1620,11 @@
             <w:tcW w:type="dxa" w:w="1234"/>
           </w:tcPr>
           <w:p>
+            <w:pPr>
+              <w:jc w:val="right"/>
+            </w:pPr>
             <w:r>
-              <w:t>390914.01</w:t>
+              <w:t>390.914,01</w:t>
             </w:r>
           </w:p>
         </w:tc>
@@ -1546,8 +1633,11 @@
             <w:tcW w:type="dxa" w:w="1234"/>
           </w:tcPr>
           <w:p>
+            <w:pPr>
+              <w:jc w:val="right"/>
+            </w:pPr>
             <w:r>
-              <w:t>0.124603</w:t>
+              <w:t>0,1246</w:t>
             </w:r>
           </w:p>
         </w:tc>
@@ -1568,6 +1658,9 @@
             <w:tcW w:type="dxa" w:w="1234"/>
           </w:tcPr>
           <w:p>
+            <w:pPr>
+              <w:jc w:val="right"/>
+            </w:pPr>
             <w:r>
               <w:t>3</w:t>
             </w:r>
@@ -1588,6 +1681,9 @@
             <w:tcW w:type="dxa" w:w="1234"/>
           </w:tcPr>
           <w:p>
+            <w:pPr>
+              <w:jc w:val="right"/>
+            </w:pPr>
             <w:r>
               <w:t>51</w:t>
             </w:r>
@@ -1598,8 +1694,11 @@
             <w:tcW w:type="dxa" w:w="1234"/>
           </w:tcPr>
           <w:p>
+            <w:pPr>
+              <w:jc w:val="right"/>
+            </w:pPr>
             <w:r>
-              <w:t>2145243.75</w:t>
+              <w:t>2.145.243,75</w:t>
             </w:r>
           </w:p>
         </w:tc>
@@ -1608,8 +1707,11 @@
             <w:tcW w:type="dxa" w:w="1234"/>
           </w:tcPr>
           <w:p>
+            <w:pPr>
+              <w:jc w:val="right"/>
+            </w:pPr>
             <w:r>
-              <w:t>375806.68</w:t>
+              <w:t>375.806,68</w:t>
             </w:r>
           </w:p>
         </w:tc>
@@ -1618,8 +1720,11 @@
             <w:tcW w:type="dxa" w:w="1234"/>
           </w:tcPr>
           <w:p>
+            <w:pPr>
+              <w:jc w:val="right"/>
+            </w:pPr>
             <w:r>
-              <w:t>0.175181</w:t>
+              <w:t>0,1752</w:t>
             </w:r>
           </w:p>
         </w:tc>
@@ -1640,6 +1745,9 @@
             <w:tcW w:type="dxa" w:w="1234"/>
           </w:tcPr>
           <w:p>
+            <w:pPr>
+              <w:jc w:val="right"/>
+            </w:pPr>
             <w:r>
               <w:t>1</w:t>
             </w:r>
@@ -1660,8 +1768,11 @@
             <w:tcW w:type="dxa" w:w="1234"/>
           </w:tcPr>
           <w:p>
+            <w:pPr>
+              <w:jc w:val="right"/>
+            </w:pPr>
             <w:r>
-              <w:t>2125</w:t>
+              <w:t>2.125</w:t>
             </w:r>
           </w:p>
         </w:tc>
@@ -1670,8 +1781,11 @@
             <w:tcW w:type="dxa" w:w="1234"/>
           </w:tcPr>
           <w:p>
+            <w:pPr>
+              <w:jc w:val="right"/>
+            </w:pPr>
             <w:r>
-              <w:t>18099269.13</w:t>
+              <w:t>18.099.269,13</w:t>
             </w:r>
           </w:p>
         </w:tc>
@@ -1680,8 +1794,11 @@
             <w:tcW w:type="dxa" w:w="1234"/>
           </w:tcPr>
           <w:p>
+            <w:pPr>
+              <w:jc w:val="right"/>
+            </w:pPr>
             <w:r>
-              <w:t>393131.23</w:t>
+              <w:t>393.131,23</w:t>
             </w:r>
           </w:p>
         </w:tc>
@@ -1690,8 +1807,11 @@
             <w:tcW w:type="dxa" w:w="1234"/>
           </w:tcPr>
           <w:p>
+            <w:pPr>
+              <w:jc w:val="right"/>
+            </w:pPr>
             <w:r>
-              <w:t>0.021721</w:t>
+              <w:t>0,0217</w:t>
             </w:r>
           </w:p>
         </w:tc>
@@ -1712,6 +1832,9 @@
             <w:tcW w:type="dxa" w:w="1234"/>
           </w:tcPr>
           <w:p>
+            <w:pPr>
+              <w:jc w:val="right"/>
+            </w:pPr>
             <w:r>
               <w:t>2</w:t>
             </w:r>
@@ -1732,6 +1855,9 @@
             <w:tcW w:type="dxa" w:w="1234"/>
           </w:tcPr>
           <w:p>
+            <w:pPr>
+              <w:jc w:val="right"/>
+            </w:pPr>
             <w:r>
               <w:t>177</w:t>
             </w:r>
@@ -1742,8 +1868,11 @@
             <w:tcW w:type="dxa" w:w="1234"/>
           </w:tcPr>
           <w:p>
+            <w:pPr>
+              <w:jc w:val="right"/>
+            </w:pPr>
             <w:r>
-              <w:t>1561397.65</w:t>
+              <w:t>1.561.397,65</w:t>
             </w:r>
           </w:p>
         </w:tc>
@@ -1752,8 +1881,11 @@
             <w:tcW w:type="dxa" w:w="1234"/>
           </w:tcPr>
           <w:p>
+            <w:pPr>
+              <w:jc w:val="right"/>
+            </w:pPr>
             <w:r>
-              <w:t>201559.53</w:t>
+              <w:t>201.559,53</w:t>
             </w:r>
           </w:p>
         </w:tc>
@@ -1762,8 +1894,11 @@
             <w:tcW w:type="dxa" w:w="1234"/>
           </w:tcPr>
           <w:p>
+            <w:pPr>
+              <w:jc w:val="right"/>
+            </w:pPr>
             <w:r>
-              <w:t>0.129089</w:t>
+              <w:t>0,1291</w:t>
             </w:r>
           </w:p>
         </w:tc>
@@ -1784,6 +1919,9 @@
             <w:tcW w:type="dxa" w:w="1234"/>
           </w:tcPr>
           <w:p>
+            <w:pPr>
+              <w:jc w:val="right"/>
+            </w:pPr>
             <w:r>
               <w:t>3</w:t>
             </w:r>
@@ -1804,6 +1942,9 @@
             <w:tcW w:type="dxa" w:w="1234"/>
           </w:tcPr>
           <w:p>
+            <w:pPr>
+              <w:jc w:val="right"/>
+            </w:pPr>
             <w:r>
               <w:t>114</w:t>
             </w:r>
@@ -1814,8 +1955,11 @@
             <w:tcW w:type="dxa" w:w="1234"/>
           </w:tcPr>
           <w:p>
+            <w:pPr>
+              <w:jc w:val="right"/>
+            </w:pPr>
             <w:r>
-              <w:t>990794.93</w:t>
+              <w:t>990.794,93</w:t>
             </w:r>
           </w:p>
         </w:tc>
@@ -1824,8 +1968,11 @@
             <w:tcW w:type="dxa" w:w="1234"/>
           </w:tcPr>
           <w:p>
+            <w:pPr>
+              <w:jc w:val="right"/>
+            </w:pPr>
             <w:r>
-              <w:t>178471.85</w:t>
+              <w:t>178.471,85</w:t>
             </w:r>
           </w:p>
         </w:tc>
@@ -1834,8 +1981,11 @@
             <w:tcW w:type="dxa" w:w="1234"/>
           </w:tcPr>
           <w:p>
+            <w:pPr>
+              <w:jc w:val="right"/>
+            </w:pPr>
             <w:r>
-              <w:t>0.180130</w:t>
+              <w:t>0,1801</w:t>
             </w:r>
           </w:p>
         </w:tc>
@@ -1856,6 +2006,9 @@
             <w:tcW w:type="dxa" w:w="1234"/>
           </w:tcPr>
           <w:p>
+            <w:pPr>
+              <w:jc w:val="right"/>
+            </w:pPr>
             <w:r>
               <w:t>1</w:t>
             </w:r>
@@ -1876,6 +2029,9 @@
             <w:tcW w:type="dxa" w:w="1234"/>
           </w:tcPr>
           <w:p>
+            <w:pPr>
+              <w:jc w:val="right"/>
+            </w:pPr>
             <w:r>
               <w:t>809</w:t>
             </w:r>
@@ -1886,8 +2042,11 @@
             <w:tcW w:type="dxa" w:w="1234"/>
           </w:tcPr>
           <w:p>
+            <w:pPr>
+              <w:jc w:val="right"/>
+            </w:pPr>
             <w:r>
-              <w:t>43611647.09</w:t>
+              <w:t>43.611.647,09</w:t>
             </w:r>
           </w:p>
         </w:tc>
@@ -1896,8 +2055,11 @@
             <w:tcW w:type="dxa" w:w="1234"/>
           </w:tcPr>
           <w:p>
+            <w:pPr>
+              <w:jc w:val="right"/>
+            </w:pPr>
             <w:r>
-              <w:t>437771.24</w:t>
+              <w:t>437.771,24</w:t>
             </w:r>
           </w:p>
         </w:tc>
@@ -1906,8 +2068,11 @@
             <w:tcW w:type="dxa" w:w="1234"/>
           </w:tcPr>
           <w:p>
+            <w:pPr>
+              <w:jc w:val="right"/>
+            </w:pPr>
             <w:r>
-              <w:t>0.010038</w:t>
+              <w:t>0,01004</w:t>
             </w:r>
           </w:p>
         </w:tc>
@@ -1928,6 +2093,9 @@
             <w:tcW w:type="dxa" w:w="1234"/>
           </w:tcPr>
           <w:p>
+            <w:pPr>
+              <w:jc w:val="right"/>
+            </w:pPr>
             <w:r>
               <w:t>2</w:t>
             </w:r>
@@ -1948,6 +2116,9 @@
             <w:tcW w:type="dxa" w:w="1234"/>
           </w:tcPr>
           <w:p>
+            <w:pPr>
+              <w:jc w:val="right"/>
+            </w:pPr>
             <w:r>
               <w:t>69</w:t>
             </w:r>
@@ -1958,8 +2129,11 @@
             <w:tcW w:type="dxa" w:w="1234"/>
           </w:tcPr>
           <w:p>
+            <w:pPr>
+              <w:jc w:val="right"/>
+            </w:pPr>
             <w:r>
-              <w:t>3693801.39</w:t>
+              <w:t>3.693.801,39</w:t>
             </w:r>
           </w:p>
         </w:tc>
@@ -1968,8 +2142,11 @@
             <w:tcW w:type="dxa" w:w="1234"/>
           </w:tcPr>
           <w:p>
+            <w:pPr>
+              <w:jc w:val="right"/>
+            </w:pPr>
             <w:r>
-              <w:t>303704.23</w:t>
+              <w:t>303.704,23</w:t>
             </w:r>
           </w:p>
         </w:tc>
@@ -1978,8 +2155,11 @@
             <w:tcW w:type="dxa" w:w="1234"/>
           </w:tcPr>
           <w:p>
+            <w:pPr>
+              <w:jc w:val="right"/>
+            </w:pPr>
             <w:r>
-              <w:t>0.082220</w:t>
+              <w:t>0,0822</w:t>
             </w:r>
           </w:p>
         </w:tc>
@@ -2000,6 +2180,9 @@
             <w:tcW w:type="dxa" w:w="1234"/>
           </w:tcPr>
           <w:p>
+            <w:pPr>
+              <w:jc w:val="right"/>
+            </w:pPr>
             <w:r>
               <w:t>3</w:t>
             </w:r>
@@ -2020,6 +2203,9 @@
             <w:tcW w:type="dxa" w:w="1234"/>
           </w:tcPr>
           <w:p>
+            <w:pPr>
+              <w:jc w:val="right"/>
+            </w:pPr>
             <w:r>
               <w:t>38</w:t>
             </w:r>
@@ -2030,8 +2216,11 @@
             <w:tcW w:type="dxa" w:w="1234"/>
           </w:tcPr>
           <w:p>
+            <w:pPr>
+              <w:jc w:val="right"/>
+            </w:pPr>
             <w:r>
-              <w:t>2244951.10</w:t>
+              <w:t>2.244.951,10</w:t>
             </w:r>
           </w:p>
         </w:tc>
@@ -2040,8 +2229,11 @@
             <w:tcW w:type="dxa" w:w="1234"/>
           </w:tcPr>
           <w:p>
+            <w:pPr>
+              <w:jc w:val="right"/>
+            </w:pPr>
             <w:r>
-              <w:t>251942.93</w:t>
+              <w:t>251.942,93</w:t>
             </w:r>
           </w:p>
         </w:tc>
@@ -2050,8 +2242,11 @@
             <w:tcW w:type="dxa" w:w="1234"/>
           </w:tcPr>
           <w:p>
+            <w:pPr>
+              <w:jc w:val="right"/>
+            </w:pPr>
             <w:r>
-              <w:t>0.112226</w:t>
+              <w:t>0,1122</w:t>
             </w:r>
           </w:p>
         </w:tc>
@@ -2072,6 +2267,9 @@
             <w:tcW w:type="dxa" w:w="1234"/>
           </w:tcPr>
           <w:p>
+            <w:pPr>
+              <w:jc w:val="right"/>
+            </w:pPr>
             <w:r>
               <w:t>1</w:t>
             </w:r>
@@ -2092,8 +2290,11 @@
             <w:tcW w:type="dxa" w:w="1234"/>
           </w:tcPr>
           <w:p>
+            <w:pPr>
+              <w:jc w:val="right"/>
+            </w:pPr>
             <w:r>
-              <w:t>1526</w:t>
+              <w:t>1.526</w:t>
             </w:r>
           </w:p>
         </w:tc>
@@ -2102,8 +2303,11 @@
             <w:tcW w:type="dxa" w:w="1234"/>
           </w:tcPr>
           <w:p>
+            <w:pPr>
+              <w:jc w:val="right"/>
+            </w:pPr>
             <w:r>
-              <w:t>6614503.17</w:t>
+              <w:t>6.614.503,17</w:t>
             </w:r>
           </w:p>
         </w:tc>
@@ -2112,8 +2316,11 @@
             <w:tcW w:type="dxa" w:w="1234"/>
           </w:tcPr>
           <w:p>
+            <w:pPr>
+              <w:jc w:val="right"/>
+            </w:pPr>
             <w:r>
-              <w:t>159269.35</w:t>
+              <w:t>159.269,35</w:t>
             </w:r>
           </w:p>
         </w:tc>
@@ -2122,8 +2329,11 @@
             <w:tcW w:type="dxa" w:w="1234"/>
           </w:tcPr>
           <w:p>
+            <w:pPr>
+              <w:jc w:val="right"/>
+            </w:pPr>
             <w:r>
-              <w:t>0.024079</w:t>
+              <w:t>0,0241</w:t>
             </w:r>
           </w:p>
         </w:tc>
@@ -2144,6 +2354,9 @@
             <w:tcW w:type="dxa" w:w="1234"/>
           </w:tcPr>
           <w:p>
+            <w:pPr>
+              <w:jc w:val="right"/>
+            </w:pPr>
             <w:r>
               <w:t>2</w:t>
             </w:r>
@@ -2164,6 +2377,9 @@
             <w:tcW w:type="dxa" w:w="1234"/>
           </w:tcPr>
           <w:p>
+            <w:pPr>
+              <w:jc w:val="right"/>
+            </w:pPr>
             <w:r>
               <w:t>156</w:t>
             </w:r>
@@ -2174,8 +2390,11 @@
             <w:tcW w:type="dxa" w:w="1234"/>
           </w:tcPr>
           <w:p>
+            <w:pPr>
+              <w:jc w:val="right"/>
+            </w:pPr>
             <w:r>
-              <w:t>672454.41</w:t>
+              <w:t>672.454,41</w:t>
             </w:r>
           </w:p>
         </w:tc>
@@ -2184,8 +2403,11 @@
             <w:tcW w:type="dxa" w:w="1234"/>
           </w:tcPr>
           <w:p>
+            <w:pPr>
+              <w:jc w:val="right"/>
+            </w:pPr>
             <w:r>
-              <w:t>84444.87</w:t>
+              <w:t>84.444,87</w:t>
             </w:r>
           </w:p>
         </w:tc>
@@ -2194,8 +2416,11 @@
             <w:tcW w:type="dxa" w:w="1234"/>
           </w:tcPr>
           <w:p>
+            <w:pPr>
+              <w:jc w:val="right"/>
+            </w:pPr>
             <w:r>
-              <w:t>0.125577</w:t>
+              <w:t>0,1256</w:t>
             </w:r>
           </w:p>
         </w:tc>
@@ -2216,6 +2441,9 @@
             <w:tcW w:type="dxa" w:w="1234"/>
           </w:tcPr>
           <w:p>
+            <w:pPr>
+              <w:jc w:val="right"/>
+            </w:pPr>
             <w:r>
               <w:t>3</w:t>
             </w:r>
@@ -2236,6 +2464,9 @@
             <w:tcW w:type="dxa" w:w="1234"/>
           </w:tcPr>
           <w:p>
+            <w:pPr>
+              <w:jc w:val="right"/>
+            </w:pPr>
             <w:r>
               <w:t>85</w:t>
             </w:r>
@@ -2246,8 +2477,11 @@
             <w:tcW w:type="dxa" w:w="1234"/>
           </w:tcPr>
           <w:p>
+            <w:pPr>
+              <w:jc w:val="right"/>
+            </w:pPr>
             <w:r>
-              <w:t>375181.03</w:t>
+              <w:t>375.181,03</w:t>
             </w:r>
           </w:p>
         </w:tc>
@@ -2256,8 +2490,11 @@
             <w:tcW w:type="dxa" w:w="1234"/>
           </w:tcPr>
           <w:p>
+            <w:pPr>
+              <w:jc w:val="right"/>
+            </w:pPr>
             <w:r>
-              <w:t>64767.96</w:t>
+              <w:t>64.767,96</w:t>
             </w:r>
           </w:p>
         </w:tc>
@@ -2266,8 +2503,11 @@
             <w:tcW w:type="dxa" w:w="1234"/>
           </w:tcPr>
           <w:p>
+            <w:pPr>
+              <w:jc w:val="right"/>
+            </w:pPr>
             <w:r>
-              <w:t>0.172631</w:t>
+              <w:t>0,1726</w:t>
             </w:r>
           </w:p>
         </w:tc>
@@ -2392,7 +2632,7 @@
         <w:rPr>
           <w:rFonts w:ascii="Consolas" w:hAnsi="Consolas"/>
         </w:rPr>
-        <w:t>2026-09-22T15:39:44.439012Z</w:t>
+        <w:t>2026-09-27T02:26:04.112353Z</w:t>
       </w:r>
     </w:p>
     <w:p>
@@ -2440,7 +2680,7 @@
         <w:rPr>
           <w:rFonts w:ascii="Consolas" w:hAnsi="Consolas"/>
         </w:rPr>
-        <w:t>false</w:t>
+        <w:t>no</w:t>
       </w:r>
     </w:p>
     <w:p>
@@ -2456,7 +2696,7 @@
         <w:rPr>
           <w:rFonts w:ascii="Consolas" w:hAnsi="Consolas"/>
         </w:rPr>
-        <w:t>e77cc6a5d3c91915cd790d92cf8cad2930a04c81</w:t>
+        <w:t>57e1246ee83b7f20a60ceee287bd73a2f62d64d6</w:t>
       </w:r>
     </w:p>
     <w:p>
@@ -2476,7 +2716,7 @@
         <w:br/>
         <w:t xml:space="preserve">  "PyYAML": "6.0.3",</w:t>
         <w:br/>
-        <w:t xml:space="preserve">  "nikodym": "1.19.0",</w:t>
+        <w:t xml:space="preserve">  "nikodym": "1.20.0",</w:t>
         <w:br/>
         <w:t xml:space="preserve">  "numpy": "2.4.6",</w:t>
         <w:br/>
@@ -2516,7 +2756,7 @@
         <w:rPr>
           <w:rFonts w:ascii="Consolas" w:hAnsi="Consolas"/>
         </w:rPr>
-        <w:t>5b9f004ccf409b18dfdb62d3948ea3d3322cd9caa2fc3d00f99ab894eed80740</w:t>
+        <w:t>c5925338574f045c38ec9a17f69d59ec787f77e79907e3a271ff39669b24d8bb</w:t>
       </w:r>
     </w:p>
     <w:p>
@@ -2664,7 +2904,7 @@
         <w:rPr>
           <w:rFonts w:ascii="Consolas" w:hAnsi="Consolas"/>
         </w:rPr>
-        <w:t>0.0963</w:t>
+        <w:t>0,0963</w:t>
       </w:r>
     </w:p>
     <w:p>
@@ -2746,7 +2986,7 @@
         <w:br/>
         <w:t xml:space="preserve">  "missing": {</w:t>
         <w:br/>
-        <w:t xml:space="preserve">    "max_missing_rate": "0.9900",</w:t>
+        <w:t xml:space="preserve">    "max_missing_rate": "0,99",</w:t>
         <w:br/>
         <w:t xml:space="preserve">    "special_values": []</w:t>
         <w:br/>
@@ -2760,7 +3000,7 @@
         <w:br/>
         <w:t xml:space="preserve">      "cohort_col": "cohorte",</w:t>
         <w:br/>
-        <w:t xml:space="preserve">      "holdout_fraction": "0.2000",</w:t>
+        <w:t xml:space="preserve">      "holdout_fraction": "0,20",</w:t>
         <w:br/>
         <w:t xml:space="preserve">      "oot_cohorts": [</w:t>
         <w:br/>
@@ -3052,7 +3292,7 @@
         <w:rPr>
           <w:rFonts w:ascii="Consolas" w:hAnsi="Consolas"/>
         </w:rPr>
-        <w:t>6000</w:t>
+        <w:t>6.000</w:t>
       </w:r>
     </w:p>
     <w:p>
@@ -3070,13 +3310,13 @@
         </w:rPr>
         <w:t>{</w:t>
         <w:br/>
-        <w:t xml:space="preserve">  "desarrollo": "0.0964",</w:t>
-        <w:br/>
-        <w:t xml:space="preserve">  "fuera_de_modelo": "0.0000",</w:t>
-        <w:br/>
-        <w:t xml:space="preserve">  "holdout": "0.1000",</w:t>
-        <w:br/>
-        <w:t xml:space="preserve">  "oot": "0.0920"</w:t>
+        <w:t xml:space="preserve">  "desarrollo": "0,0964",</w:t>
+        <w:br/>
+        <w:t xml:space="preserve">  "fuera_de_modelo": "0,0000",</w:t>
+        <w:br/>
+        <w:t xml:space="preserve">  "holdout": "0,1000",</w:t>
+        <w:br/>
+        <w:t xml:space="preserve">  "oot": "0,09197"</w:t>
         <w:br/>
         <w:t>}</w:t>
       </w:r>
@@ -3222,17 +3462,17 @@
         <w:br/>
         <w:t xml:space="preserve">  "fit_statistics": {</w:t>
         <w:br/>
-        <w:t xml:space="preserve">    "aic": "11002.31",</w:t>
+        <w:t xml:space="preserve">    "aic": "11.002,31",</w:t>
         <w:br/>
         <w:t xml:space="preserve">    "converged": "True",</w:t>
         <w:br/>
-        <w:t xml:space="preserve">    "deviance": "10984.31",</w:t>
+        <w:t xml:space="preserve">    "deviance": "10.984,31",</w:t>
         <w:br/>
         <w:t xml:space="preserve">    "df_model": 8,</w:t>
         <w:br/>
         <w:t xml:space="preserve">    "df_resid": 26636,</w:t>
         <w:br/>
-        <w:t xml:space="preserve">    "llf": "-5492.16",</w:t>
+        <w:t xml:space="preserve">    "llf": "-5.492,16",</w:t>
         <w:br/>
         <w:t xml:space="preserve">    "n_iterations": 6,</w:t>
         <w:br/>
@@ -3242,7 +3482,7 @@
         <w:br/>
         <w:t xml:space="preserve">  "link": "logit",</w:t>
         <w:br/>
-        <w:t xml:space="preserve">  "max_observed_time": "5.000000",</w:t>
+        <w:t xml:space="preserve">  "max_observed_time": "5,0000",</w:t>
         <w:br/>
         <w:t xml:space="preserve">  "method": "discrete_hazard",</w:t>
         <w:br/>
@@ -3346,7 +3586,7 @@
         <w:br/>
         <w:t xml:space="preserve">  "kaplan_meier": {</w:t>
         <w:br/>
-        <w:t xml:space="preserve">    "confidence_level": "0.950000",</w:t>
+        <w:t xml:space="preserve">    "confidence_level": "0,95",</w:t>
         <w:br/>
         <w:t xml:space="preserve">    "confidence_transform": "loglog"</w:t>
         <w:br/>
@@ -3432,7 +3672,7 @@
         <w:rPr>
           <w:rFonts w:ascii="Consolas" w:hAnsi="Consolas"/>
         </w:rPr>
-        <w:t>1502</w:t>
+        <w:t>1.502</w:t>
       </w:r>
     </w:p>
     <w:p>
@@ -3464,7 +3704,7 @@
         <w:rPr>
           <w:rFonts w:ascii="Consolas" w:hAnsi="Consolas"/>
         </w:rPr>
-        <w:t>6000</w:t>
+        <w:t>6.000</w:t>
       </w:r>
     </w:p>
     <w:p>
@@ -3692,9 +3932,9 @@
         </w:rPr>
         <w:t>{</w:t>
         <w:br/>
-        <w:t xml:space="preserve">  "max_pd_cumulative": "0.995033",</w:t>
-        <w:br/>
-        <w:t xml:space="preserve">  "min_survival": "0.004967",</w:t>
+        <w:t xml:space="preserve">  "max_pd_cumulative": "0,99503",</w:t>
+        <w:br/>
+        <w:t xml:space="preserve">  "min_survival": "0,00497",</w:t>
         <w:br/>
         <w:t xml:space="preserve">  "n_periods": 5,</w:t>
         <w:br/>
@@ -3860,11 +4100,11 @@
         <w:br/>
         <w:t xml:space="preserve">    "covariate_cols": [],</w:t>
         <w:br/>
-        <w:t xml:space="preserve">    "lgd_cap": "1.000000",</w:t>
+        <w:t xml:space="preserve">    "lgd_cap": "1,00",</w:t>
         <w:br/>
         <w:t xml:space="preserve">    "lgd_col": "lgd",</w:t>
         <w:br/>
-        <w:t xml:space="preserve">    "lgd_floor": "0.000000",</w:t>
+        <w:t xml:space="preserve">    "lgd_floor": "0,00",</w:t>
         <w:br/>
         <w:t xml:space="preserve">    "method": "provided",</w:t>
         <w:br/>
@@ -3934,9 +4174,9 @@
         <w:br/>
         <w:t xml:space="preserve">    "rating_col": null,</w:t>
         <w:br/>
-        <w:t xml:space="preserve">    "sicr_pd_pit_backstop_multiple": "3.000000",</w:t>
-        <w:br/>
-        <w:t xml:space="preserve">    "sicr_pd_ratio_threshold": "2.000000",</w:t>
+        <w:t xml:space="preserve">    "sicr_pd_pit_backstop_multiple": "3,00",</w:t>
+        <w:br/>
+        <w:t xml:space="preserve">    "sicr_pd_ratio_threshold": "2,00",</w:t>
         <w:br/>
         <w:t xml:space="preserve">    "stage_override_col": null</w:t>
         <w:br/>
@@ -3980,7 +4220,7 @@
         <w:rPr>
           <w:rFonts w:ascii="Consolas" w:hAnsi="Consolas"/>
         </w:rPr>
-        <w:t>6000</w:t>
+        <w:t>6.000</w:t>
       </w:r>
     </w:p>
     <w:p>
@@ -3996,7 +4236,7 @@
         <w:rPr>
           <w:rFonts w:ascii="Consolas" w:hAnsi="Consolas"/>
         </w:rPr>
-        <w:t>5235</w:t>
+        <w:t>5.235</w:t>
       </w:r>
     </w:p>
     <w:p>
@@ -4062,7 +4302,7 @@
         </w:rPr>
         <w:t>{</w:t>
         <w:br/>
-        <w:t xml:space="preserve">  "base": "1.000000"</w:t>
+        <w:t xml:space="preserve">  "base": "1,0000"</w:t>
         <w:br/>
         <w:t>}</w:t>
       </w:r>
@@ -4132,7 +4372,7 @@
         <w:rPr>
           <w:rFonts w:ascii="Consolas" w:hAnsi="Consolas"/>
         </w:rPr>
-        <w:t>114325314.70</w:t>
+        <w:t>114.325.314,70</w:t>
       </w:r>
     </w:p>
     <w:p>
@@ -4148,7 +4388,7 @@
         <w:rPr>
           <w:rFonts w:ascii="Consolas" w:hAnsi="Consolas"/>
         </w:rPr>
-        <w:t>3423116.12</w:t>
+        <w:t>3.423.116,12</w:t>
       </w:r>
     </w:p>
     <w:p>
@@ -4174,7 +4414,7 @@
         </w:rPr>
         <w:t>{</w:t>
         <w:br/>
-        <w:t xml:space="preserve">  "base": "6911516.43"</w:t>
+        <w:t xml:space="preserve">  "base": "6.911.516,43"</w:t>
         <w:br/>
         <w:t>}</w:t>
       </w:r>
@@ -4212,7 +4452,7 @@
         <w:br/>
         <w:t xml:space="preserve">  "policy": "none",</w:t>
         <w:br/>
-        <w:t xml:space="preserve">  "total_difference": "0.000000"</w:t>
+        <w:t xml:space="preserve">  "total_difference": "0,0000"</w:t>
         <w:br/>
         <w:t>}</w:t>
       </w:r>

</xml_diff>

<commit_message>
chore(demo): recaptura de la demo con bayesrisk 2.0.0 en la rama del renombre (run 36337707336 sobre 03c8b84, git_dirty=false); run_id publicados movidos en deploy.yml
Autorizada por el prompt de Cami (A5) en la rama; no entra a main sin el OK de A7. results-*.json:
library_versions.bayesrisk=2.0.0, git_sha=03c8b84, git_dirty=false. Firmas regeneradas y
check_demo_report_copy OK. Las únicas apariciones de «nikodym» en los fixtures son rutas del
runner (/home/runner/work/nikodym/…): el repositorio no se renombra sin el OK de A7.

Co-Authored-By: Claude Opus 5.5 <noreply@anthropic.com>
</commit_message>
<xml_diff>
--- a/web/src/fixtures/demo/report-ifrs9.docx
+++ b/web/src/fixtures/demo/report-ifrs9.docx
@@ -199,7 +199,7 @@
         <w:rPr>
           <w:rFonts w:ascii="Consolas" w:hAnsi="Consolas"/>
         </w:rPr>
-        <w:t>git_sha=57e1246ee83b7f20a60ceee287bd73a2f62d64d6</w:t>
+        <w:t>git_sha=03c8b842d6f7ed740ab381384e0e4f4b8008b2a8</w:t>
       </w:r>
     </w:p>
     <w:p>
@@ -2632,7 +2632,7 @@
         <w:rPr>
           <w:rFonts w:ascii="Consolas" w:hAnsi="Consolas"/>
         </w:rPr>
-        <w:t>2026-09-27T02:26:04.112353Z</w:t>
+        <w:t>2026-09-27T17:39:17.821534Z</w:t>
       </w:r>
     </w:p>
     <w:p>
@@ -2696,7 +2696,7 @@
         <w:rPr>
           <w:rFonts w:ascii="Consolas" w:hAnsi="Consolas"/>
         </w:rPr>
-        <w:t>57e1246ee83b7f20a60ceee287bd73a2f62d64d6</w:t>
+        <w:t>03c8b842d6f7ed740ab381384e0e4f4b8008b2a8</w:t>
       </w:r>
     </w:p>
     <w:p>
@@ -2716,7 +2716,7 @@
         <w:br/>
         <w:t xml:space="preserve">  "PyYAML": "6.0.3",</w:t>
         <w:br/>
-        <w:t xml:space="preserve">  "nikodym": "1.20.0",</w:t>
+        <w:t xml:space="preserve">  "bayesrisk": "2.0.0",</w:t>
         <w:br/>
         <w:t xml:space="preserve">  "numpy": "2.4.6",</w:t>
         <w:br/>
@@ -2756,7 +2756,7 @@
         <w:rPr>
           <w:rFonts w:ascii="Consolas" w:hAnsi="Consolas"/>
         </w:rPr>
-        <w:t>c5925338574f045c38ec9a17f69d59ec787f77e79907e3a271ff39669b24d8bb</w:t>
+        <w:t>53bc20eb0284c31924233eaefc5e26ad05d274791b6bad8f127d40ccbd37eedb</w:t>
       </w:r>
     </w:p>
     <w:p>
@@ -2788,7 +2788,7 @@
         <w:rPr>
           <w:rFonts w:ascii="Consolas" w:hAnsi="Consolas"/>
         </w:rPr>
-        <w:t>32c611ad4b1e061c14e1262548bf30346610d7529a6e4fb7bc52c68ec3540d24</w:t>
+        <w:t>6c446c2ad040ff52262caae544ea32b26af36b8abebe5f10d5d276f49e967322</w:t>
       </w:r>
     </w:p>
     <w:p>
@@ -2980,7 +2980,7 @@
         <w:br/>
         <w:t xml:space="preserve">    "file_format": "auto",</w:t>
         <w:br/>
-        <w:t xml:space="preserve">    "source": ".nikodym-demo-fixtures-f4/datasets/ifrs9_retail_latam.parquet"</w:t>
+        <w:t xml:space="preserve">    "source": ".bayesrisk-demo-fixtures-f4/datasets/ifrs9_retail_latam.parquet"</w:t>
         <w:br/>
         <w:t xml:space="preserve">  },</w:t>
         <w:br/>

</xml_diff>

<commit_message>
demo: recaptura de los fixtures con bayesrisk 2.1.0
Recaptura 36426163901 sobre el bump 83917ce (bayesrisk 2.1.0, git_dirty=false), con el OK de
Cami. Trae los resúmenes, los motivos legibles (detail_legible) y los tramos del EDA de B1; el
informe recapturado no tiene «pts=», «iv=» ni «wald_p=» (el anterior, 56 «pts=»). Firmas
regeneradas, check_demo_report_copy OK, run_id publicados movidos en deploy.yml
(2da4e284…, dbb25dc8…). El test de ResultsTab que exigía el detail crudo del motor en pantalla
pasa a exigir el legible, como prescribe D-PAN-4.

Co-Authored-By: Claude Opus 5.5 <noreply@anthropic.com>
</commit_message>
<xml_diff>
--- a/web/src/fixtures/demo/report-ifrs9.docx
+++ b/web/src/fixtures/demo/report-ifrs9.docx
@@ -163,7 +163,7 @@
           </w:tcPr>
           <w:p>
             <w:r>
-              <w:t>2026-09-27</w:t>
+              <w:t>2026-09-28</w:t>
             </w:r>
           </w:p>
         </w:tc>
@@ -199,7 +199,7 @@
         <w:rPr>
           <w:rFonts w:ascii="Consolas" w:hAnsi="Consolas"/>
         </w:rPr>
-        <w:t>git_sha=03c8b842d6f7ed740ab381384e0e4f4b8008b2a8</w:t>
+        <w:t>git_sha=83917ce98ec05569b317097d2c88d7556d6982fc</w:t>
       </w:r>
     </w:p>
     <w:p>
@@ -2632,7 +2632,7 @@
         <w:rPr>
           <w:rFonts w:ascii="Consolas" w:hAnsi="Consolas"/>
         </w:rPr>
-        <w:t>2026-09-27T17:39:17.821534Z</w:t>
+        <w:t>2026-09-28T13:20:53.460885Z</w:t>
       </w:r>
     </w:p>
     <w:p>
@@ -2696,7 +2696,7 @@
         <w:rPr>
           <w:rFonts w:ascii="Consolas" w:hAnsi="Consolas"/>
         </w:rPr>
-        <w:t>03c8b842d6f7ed740ab381384e0e4f4b8008b2a8</w:t>
+        <w:t>83917ce98ec05569b317097d2c88d7556d6982fc</w:t>
       </w:r>
     </w:p>
     <w:p>
@@ -2716,7 +2716,7 @@
         <w:br/>
         <w:t xml:space="preserve">  "PyYAML": "6.0.3",</w:t>
         <w:br/>
-        <w:t xml:space="preserve">  "bayesrisk": "2.0.0",</w:t>
+        <w:t xml:space="preserve">  "bayesrisk": "2.1.0",</w:t>
         <w:br/>
         <w:t xml:space="preserve">  "numpy": "2.4.6",</w:t>
         <w:br/>
@@ -2756,7 +2756,7 @@
         <w:rPr>
           <w:rFonts w:ascii="Consolas" w:hAnsi="Consolas"/>
         </w:rPr>
-        <w:t>53bc20eb0284c31924233eaefc5e26ad05d274791b6bad8f127d40ccbd37eedb</w:t>
+        <w:t>931a0a0e187d6ba52fee369fe6118d0b0263ae350f6cec5f89303b44af8b28ac</w:t>
       </w:r>
     </w:p>
     <w:p>

</xml_diff>

<commit_message>
release(2.3.0): recaptura de la demo (37009193742)
Fixtures de la demo recapturados con bayesrisk 2.3.0 desde el bump 2b2d47f (git_dirty=false): el
F1 trae la tabla de Hosmer-Lemeshow por grupo de sus tres muestras y la frase con la mayor
diferencia, y ya no registra falsas alarmas bin_no_visto. Firmas regeneradas;
check_demo_report_copy y check:demo-bundle verdes; los run_id que deploy.yml busca en vivo pasan a
8e9446ba… (F1) y a2822ae2… (IFRS 9). Suite local completa sobre este árbol: 7.491 passed (un rojo
del entorno —pyc con la ruta anterior del checkout— verde tras limpiar la caché); vitest 928.

Co-Authored-By: Claude Opus 5.5 <noreply@anthropic.com>
</commit_message>
<xml_diff>
--- a/web/src/fixtures/demo/report-ifrs9.docx
+++ b/web/src/fixtures/demo/report-ifrs9.docx
@@ -163,7 +163,7 @@
           </w:tcPr>
           <w:p>
             <w:r>
-              <w:t>2026-09-28</w:t>
+              <w:t>2026-10-02</w:t>
             </w:r>
           </w:p>
         </w:tc>
@@ -199,7 +199,7 @@
         <w:rPr>
           <w:rFonts w:ascii="Consolas" w:hAnsi="Consolas"/>
         </w:rPr>
-        <w:t>git_sha=83917ce98ec05569b317097d2c88d7556d6982fc</w:t>
+        <w:t>git_sha=2b2d47fa00aa10d36859b3e8237c7130e8562321</w:t>
       </w:r>
     </w:p>
     <w:p>
@@ -2632,7 +2632,7 @@
         <w:rPr>
           <w:rFonts w:ascii="Consolas" w:hAnsi="Consolas"/>
         </w:rPr>
-        <w:t>2026-09-28T13:20:53.460885Z</w:t>
+        <w:t>2026-10-02T12:52:55.310086Z</w:t>
       </w:r>
     </w:p>
     <w:p>
@@ -2696,7 +2696,7 @@
         <w:rPr>
           <w:rFonts w:ascii="Consolas" w:hAnsi="Consolas"/>
         </w:rPr>
-        <w:t>83917ce98ec05569b317097d2c88d7556d6982fc</w:t>
+        <w:t>2b2d47fa00aa10d36859b3e8237c7130e8562321</w:t>
       </w:r>
     </w:p>
     <w:p>
@@ -2716,7 +2716,7 @@
         <w:br/>
         <w:t xml:space="preserve">  "PyYAML": "6.0.3",</w:t>
         <w:br/>
-        <w:t xml:space="preserve">  "bayesrisk": "2.1.0",</w:t>
+        <w:t xml:space="preserve">  "bayesrisk": "2.3.0",</w:t>
         <w:br/>
         <w:t xml:space="preserve">  "numpy": "2.4.6",</w:t>
         <w:br/>
@@ -2756,7 +2756,7 @@
         <w:rPr>
           <w:rFonts w:ascii="Consolas" w:hAnsi="Consolas"/>
         </w:rPr>
-        <w:t>931a0a0e187d6ba52fee369fe6118d0b0263ae350f6cec5f89303b44af8b28ac</w:t>
+        <w:t>8d799329fd48f0ba66650fc4270a7196d853de05b08fc6554722a1ff42240b4d</w:t>
       </w:r>
     </w:p>
     <w:p>

</xml_diff>

<commit_message>
release(2.5.0): recaptura de la demo (37335493736)
Fixtures de la demo recapturados con bayesrisk 2.5.0 desde el bump 0efa603 (git_dirty=false): el
informe IFRS 9 abre con su página «Resumen de la corrida» y publica la curva de PD por cartera; el
F1 sólo cambia en el lineage. Firmas regeneradas; check_demo_report_copy y check:demo-bundle
verdes; los run_id que deploy.yml busca en vivo pasan a 35889352… (F1) y 6470fc0f… (IFRS 9). El
test de ResultsTab sobre los fixtures cuenta ahora las cuatro etapas de una provisión y exige
«Supuestos» y la curva por cartera; vitest 941.

Co-Authored-By: Claude Opus 5.5 <noreply@anthropic.com>
</commit_message>
<xml_diff>
--- a/web/src/fixtures/demo/report-ifrs9.docx
+++ b/web/src/fixtures/demo/report-ifrs9.docx
@@ -163,7 +163,7 @@
           </w:tcPr>
           <w:p>
             <w:r>
-              <w:t>2026-10-02</w:t>
+              <w:t>2026-10-05</w:t>
             </w:r>
           </w:p>
         </w:tc>
@@ -199,7 +199,7 @@
         <w:rPr>
           <w:rFonts w:ascii="Consolas" w:hAnsi="Consolas"/>
         </w:rPr>
-        <w:t>git_sha=2b2d47fa00aa10d36859b3e8237c7130e8562321</w:t>
+        <w:t>git_sha=0efa603d6fce982384e60585fcf7c8781a77e82f</w:t>
       </w:r>
     </w:p>
     <w:p>
@@ -344,6 +344,475 @@
           </w:tcPr>
           <w:p>
             <w:r/>
+          </w:p>
+        </w:tc>
+      </w:tr>
+    </w:tbl>
+    <w:p>
+      <w:r>
+        <w:br w:type="page"/>
+      </w:r>
+    </w:p>
+    <w:p>
+      <w:pPr>
+        <w:pStyle w:val="Heading1"/>
+      </w:pPr>
+      <w:r>
+        <w:t>Resumen de la corrida</w:t>
+      </w:r>
+    </w:p>
+    <w:p>
+      <w:r>
+        <w:t>Lo que cuenta la corrida al terminar, con la misma fuente que la puerta guiada y la pestaña Resultados: el estado de la ejecución, los supuestos de los que depende la provisión, sus cifras clave, qué revisar, las decisiones humanas con su motivo y dónde queda cada archivo. Una provisión no tiene veredicto técnico del motor: el juicio sobre ella lo firma el validador en el resumen ejecutivo.</w:t>
+      </w:r>
+    </w:p>
+    <w:p>
+      <w:r>
+        <w:t>Las rutas son las que el informe escribió al generarse: si la corrida se copia o se archiva después —desde la interfaz, o al apartar una corrida anterior—, los archivos se buscan en su carpeta de destino, y el registro de auditoría deja constancia de cada uno que se escribió.</w:t>
+      </w:r>
+    </w:p>
+    <w:tbl>
+      <w:tblPr>
+        <w:tblStyle w:val="TableGrid"/>
+        <w:tblW w:type="auto" w:w="0"/>
+        <w:tblLook w:firstColumn="1" w:firstRow="1" w:lastColumn="0" w:lastRow="0" w:noHBand="0" w:noVBand="1" w:val="04A0"/>
+      </w:tblPr>
+      <w:tblGrid>
+        <w:gridCol w:w="4320"/>
+        <w:gridCol w:w="4320"/>
+      </w:tblGrid>
+      <w:tr>
+        <w:tc>
+          <w:tcPr>
+            <w:tcW w:type="dxa" w:w="4320"/>
+          </w:tcPr>
+          <w:p>
+            <w:r>
+              <w:rPr>
+                <w:b/>
+              </w:rPr>
+              <w:t>Ejecución</w:t>
+            </w:r>
+          </w:p>
+        </w:tc>
+        <w:tc>
+          <w:tcPr>
+            <w:tcW w:type="dxa" w:w="4320"/>
+          </w:tcPr>
+          <w:p>
+            <w:r>
+              <w:t>corrieron sin fallos Cartera, Curva de PD y Provisión IFRS 9; este informe es la última etapa de la corrida</w:t>
+            </w:r>
+          </w:p>
+        </w:tc>
+      </w:tr>
+    </w:tbl>
+    <w:p>
+      <w:r>
+        <w:rPr>
+          <w:b/>
+          <w:sz w:val="18"/>
+        </w:rPr>
+        <w:t>Supuestos</w:t>
+      </w:r>
+    </w:p>
+    <w:p>
+      <w:pPr>
+        <w:pStyle w:val="ListBullet"/>
+      </w:pPr>
+      <w:r>
+        <w:t>La PD es a lo largo del ciclo (TTC): no se ajusta a las condiciones actuales ni a escenarios macroeconómicos</w:t>
+      </w:r>
+    </w:p>
+    <w:p>
+      <w:pPr>
+        <w:pStyle w:val="ListBullet"/>
+      </w:pPr>
+      <w:r>
+        <w:t>Un escenario único, sin ponderación macroeconómica</w:t>
+      </w:r>
+    </w:p>
+    <w:p>
+      <w:pPr>
+        <w:pStyle w:val="ListBullet"/>
+      </w:pPr>
+      <w:r>
+        <w:t>La curva de PD se ajusta a la historia de incumplimientos de la propia cartera, con 4 covariables</w:t>
+      </w:r>
+    </w:p>
+    <w:p>
+      <w:pPr>
+        <w:pStyle w:val="ListBullet"/>
+      </w:pPr>
+      <w:r>
+        <w:t>Los 12 meses del Stage 1 son el primer período de la curva (1 año)</w:t>
+      </w:r>
+    </w:p>
+    <w:p>
+      <w:pPr>
+        <w:pStyle w:val="ListBullet"/>
+      </w:pPr>
+      <w:r>
+        <w:t>Stage 2 desde 30 días de mora y Stage 3 desde 90: las presunciones de IFRS 9 (5.5.11 y B5.5.37)</w:t>
+      </w:r>
+    </w:p>
+    <w:p>
+      <w:pPr>
+        <w:pStyle w:val="ListBullet"/>
+      </w:pPr>
+      <w:r>
+        <w:t>La exposición (EAD) se proyectó constante a lo largo de la vida de cada operación, porque el dataset no trae un perfil de exposición por período: si la cartera amortiza, la ECL de por vida queda sobrestimada</w:t>
+      </w:r>
+    </w:p>
+    <w:p>
+      <w:pPr>
+        <w:pStyle w:val="ListBullet"/>
+      </w:pPr>
+      <w:r>
+        <w:t>La LGD es la del archivo de cartera, la misma en cada período</w:t>
+      </w:r>
+    </w:p>
+    <w:p>
+      <w:r>
+        <w:rPr>
+          <w:b/>
+          <w:sz w:val="18"/>
+        </w:rPr>
+        <w:t>Cifras clave</w:t>
+      </w:r>
+    </w:p>
+    <w:tbl>
+      <w:tblPr>
+        <w:tblStyle w:val="TableGrid"/>
+        <w:tblW w:type="auto" w:w="0"/>
+        <w:tblLook w:firstColumn="1" w:firstRow="1" w:lastColumn="0" w:lastRow="0" w:noHBand="0" w:noVBand="1" w:val="04A0"/>
+      </w:tblPr>
+      <w:tblGrid>
+        <w:gridCol w:w="4320"/>
+        <w:gridCol w:w="4320"/>
+      </w:tblGrid>
+      <w:tr>
+        <w:tc>
+          <w:tcPr>
+            <w:tcW w:type="dxa" w:w="4320"/>
+          </w:tcPr>
+          <w:p>
+            <w:r>
+              <w:rPr>
+                <w:b/>
+              </w:rPr>
+              <w:t>Cifra</w:t>
+            </w:r>
+          </w:p>
+        </w:tc>
+        <w:tc>
+          <w:tcPr>
+            <w:tcW w:type="dxa" w:w="4320"/>
+          </w:tcPr>
+          <w:p>
+            <w:r>
+              <w:rPr>
+                <w:b/>
+              </w:rPr>
+              <w:t>Valor</w:t>
+            </w:r>
+          </w:p>
+        </w:tc>
+      </w:tr>
+      <w:tr>
+        <w:tc>
+          <w:tcPr>
+            <w:tcW w:type="dxa" w:w="4320"/>
+          </w:tcPr>
+          <w:p>
+            <w:r>
+              <w:t>ECL total</w:t>
+            </w:r>
+          </w:p>
+        </w:tc>
+        <w:tc>
+          <w:tcPr>
+            <w:tcW w:type="dxa" w:w="4320"/>
+          </w:tcPr>
+          <w:p>
+            <w:r>
+              <w:t>3.423.116</w:t>
+            </w:r>
+          </w:p>
+        </w:tc>
+      </w:tr>
+      <w:tr>
+        <w:tc>
+          <w:tcPr>
+            <w:tcW w:type="dxa" w:w="4320"/>
+          </w:tcPr>
+          <w:p>
+            <w:r>
+              <w:t>Cobertura (ECL sobre la exposición)</w:t>
+            </w:r>
+          </w:p>
+        </w:tc>
+        <w:tc>
+          <w:tcPr>
+            <w:tcW w:type="dxa" w:w="4320"/>
+          </w:tcPr>
+          <w:p>
+            <w:r>
+              <w:t>2,99 %</w:t>
+            </w:r>
+          </w:p>
+        </w:tc>
+      </w:tr>
+      <w:tr>
+        <w:tc>
+          <w:tcPr>
+            <w:tcW w:type="dxa" w:w="4320"/>
+          </w:tcPr>
+          <w:p>
+            <w:r>
+              <w:t>Exposición en Stage 2 y 3</w:t>
+            </w:r>
+          </w:p>
+        </w:tc>
+        <w:tc>
+          <w:tcPr>
+            <w:tcW w:type="dxa" w:w="4320"/>
+          </w:tcPr>
+          <w:p>
+            <w:r>
+              <w:t>12,96 %</w:t>
+            </w:r>
+          </w:p>
+        </w:tc>
+      </w:tr>
+      <w:tr>
+        <w:tc>
+          <w:tcPr>
+            <w:tcW w:type="dxa" w:w="4320"/>
+          </w:tcPr>
+          <w:p>
+            <w:r>
+              <w:t>ECL de Stage 2 y 3</w:t>
+            </w:r>
+          </w:p>
+        </w:tc>
+        <w:tc>
+          <w:tcPr>
+            <w:tcW w:type="dxa" w:w="4320"/>
+          </w:tcPr>
+          <w:p>
+            <w:r>
+              <w:t>54,09 %</w:t>
+            </w:r>
+          </w:p>
+        </w:tc>
+      </w:tr>
+      <w:tr>
+        <w:tc>
+          <w:tcPr>
+            <w:tcW w:type="dxa" w:w="4320"/>
+          </w:tcPr>
+          <w:p>
+            <w:r>
+              <w:t>PD a 12 meses media, ponderada por la exposición</w:t>
+            </w:r>
+          </w:p>
+        </w:tc>
+        <w:tc>
+          <w:tcPr>
+            <w:tcW w:type="dxa" w:w="4320"/>
+          </w:tcPr>
+          <w:p>
+            <w:r>
+              <w:t>6,31 %</w:t>
+            </w:r>
+          </w:p>
+        </w:tc>
+      </w:tr>
+    </w:tbl>
+    <w:p>
+      <w:r>
+        <w:rPr>
+          <w:b/>
+          <w:sz w:val="18"/>
+        </w:rPr>
+        <w:t>Qué revisar</w:t>
+      </w:r>
+    </w:p>
+    <w:p>
+      <w:pPr>
+        <w:pStyle w:val="ListBullet"/>
+      </w:pPr>
+      <w:r>
+        <w:t>⚠ Provisión IFRS 9: La provisión usa la PD a lo largo del ciclo (TTC), sin ajuste a las condiciones actuales ni a escenarios macroeconómicos: IFRS 9 (5.5.17) pide considerar información razonable sobre el presente y el futuro</w:t>
+      </w:r>
+    </w:p>
+    <w:p>
+      <w:pPr>
+        <w:pStyle w:val="ListBullet"/>
+      </w:pPr>
+      <w:r>
+        <w:t>⚠ Provisión IFRS 9: El aumento significativo del riesgo se detecta sólo por la mora y la marca de incumplimiento: la corrida no trae PD de origen, rating ni decisión cualitativa con que compararlo</w:t>
+      </w:r>
+    </w:p>
+    <w:p>
+      <w:r>
+        <w:rPr>
+          <w:b/>
+          <w:sz w:val="18"/>
+        </w:rPr>
+        <w:t>Decisiones humanas registradas</w:t>
+      </w:r>
+    </w:p>
+    <w:p>
+      <w:r>
+        <w:rPr>
+          <w:i/>
+        </w:rPr>
+        <w:t>Ninguna decisión humana registrada; lo que se decidió vive en el config de la corrida.</w:t>
+      </w:r>
+    </w:p>
+    <w:p>
+      <w:r>
+        <w:rPr>
+          <w:b/>
+          <w:sz w:val="18"/>
+        </w:rPr>
+        <w:t>Dónde quedó cada archivo</w:t>
+      </w:r>
+    </w:p>
+    <w:tbl>
+      <w:tblPr>
+        <w:tblStyle w:val="TableGrid"/>
+        <w:tblW w:type="auto" w:w="0"/>
+        <w:tblLook w:firstColumn="1" w:firstRow="1" w:lastColumn="0" w:lastRow="0" w:noHBand="0" w:noVBand="1" w:val="04A0"/>
+      </w:tblPr>
+      <w:tblGrid>
+        <w:gridCol w:w="4320"/>
+        <w:gridCol w:w="4320"/>
+      </w:tblGrid>
+      <w:tr>
+        <w:tc>
+          <w:tcPr>
+            <w:tcW w:type="dxa" w:w="4320"/>
+          </w:tcPr>
+          <w:p>
+            <w:r>
+              <w:rPr>
+                <w:b/>
+              </w:rPr>
+              <w:t>Informe HTML</w:t>
+            </w:r>
+          </w:p>
+        </w:tc>
+        <w:tc>
+          <w:tcPr>
+            <w:tcW w:type="dxa" w:w="4320"/>
+          </w:tcPr>
+          <w:p>
+            <w:r>
+              <w:t>/home/runner/work/bayesrisk/bayesrisk/.bayesrisk-demo-fixtures-f4/reports/ifrs9_ecl_report.html</w:t>
+            </w:r>
+          </w:p>
+        </w:tc>
+      </w:tr>
+      <w:tr>
+        <w:tc>
+          <w:tcPr>
+            <w:tcW w:type="dxa" w:w="4320"/>
+          </w:tcPr>
+          <w:p>
+            <w:r>
+              <w:rPr>
+                <w:b/>
+              </w:rPr>
+              <w:t>Informe PDF</w:t>
+            </w:r>
+          </w:p>
+        </w:tc>
+        <w:tc>
+          <w:tcPr>
+            <w:tcW w:type="dxa" w:w="4320"/>
+          </w:tcPr>
+          <w:p>
+            <w:r>
+              <w:t>/home/runner/work/bayesrisk/bayesrisk/.bayesrisk-demo-fixtures-f4/reports/ifrs9_ecl_report.pdf (se escribe si el extra pdf está instalado)</w:t>
+            </w:r>
+          </w:p>
+        </w:tc>
+      </w:tr>
+      <w:tr>
+        <w:tc>
+          <w:tcPr>
+            <w:tcW w:type="dxa" w:w="4320"/>
+          </w:tcPr>
+          <w:p>
+            <w:r>
+              <w:rPr>
+                <w:b/>
+              </w:rPr>
+              <w:t>Informe Word</w:t>
+            </w:r>
+          </w:p>
+        </w:tc>
+        <w:tc>
+          <w:tcPr>
+            <w:tcW w:type="dxa" w:w="4320"/>
+          </w:tcPr>
+          <w:p>
+            <w:r>
+              <w:t>/home/runner/work/bayesrisk/bayesrisk/.bayesrisk-demo-fixtures-f4/reports/ifrs9_ecl_report.docx (se escribe si el extra docx está instalado)</w:t>
+            </w:r>
+          </w:p>
+        </w:tc>
+      </w:tr>
+      <w:tr>
+        <w:tc>
+          <w:tcPr>
+            <w:tcW w:type="dxa" w:w="4320"/>
+          </w:tcPr>
+          <w:p>
+            <w:r>
+              <w:rPr>
+                <w:b/>
+              </w:rPr>
+              <w:t>Fuente editable (Quarto)</w:t>
+            </w:r>
+          </w:p>
+        </w:tc>
+        <w:tc>
+          <w:tcPr>
+            <w:tcW w:type="dxa" w:w="4320"/>
+          </w:tcPr>
+          <w:p>
+            <w:r>
+              <w:t>/home/runner/work/bayesrisk/bayesrisk/.bayesrisk-demo-fixtures-f4/reports/ifrs9_ecl_report.qmd</w:t>
+            </w:r>
+          </w:p>
+        </w:tc>
+      </w:tr>
+      <w:tr>
+        <w:tc>
+          <w:tcPr>
+            <w:tcW w:type="dxa" w:w="4320"/>
+          </w:tcPr>
+          <w:p>
+            <w:r>
+              <w:rPr>
+                <w:b/>
+              </w:rPr>
+              <w:t>Registro de auditoría</w:t>
+            </w:r>
+          </w:p>
+        </w:tc>
+        <w:tc>
+          <w:tcPr>
+            <w:tcW w:type="dxa" w:w="4320"/>
+          </w:tcPr>
+          <w:p>
+            <w:r>
+              <w:t>en la ruta que fija la sección audit del config</w:t>
+            </w:r>
           </w:p>
         </w:tc>
       </w:tr>
@@ -1303,7 +1772,1165 @@
         <w:pStyle w:val="Heading2"/>
       </w:pPr>
       <w:r>
-        <w:t>4.1 Pérdida crediticia esperada (ECL) por etapas</w:t>
+        <w:t>4.1 Supervivencia y curva PD lifetime</w:t>
+      </w:r>
+    </w:p>
+    <w:p>
+      <w:r>
+        <w:t>La curva de PD de por vida que estimó el modelo de supervivencia sobre la historia de incumplimientos de la propia cartera.</w:t>
+      </w:r>
+    </w:p>
+    <w:p>
+      <w:r>
+        <w:t>La primera tabla da la PD acumulada al cierre de cada período de la curva, como promedio simple de las operaciones de cada cartera y de toda la cartera: no pondera por exposición.</w:t>
+      </w:r>
+    </w:p>
+    <w:p>
+      <w:r>
+        <w:t>La tabla de coeficientes da el ajuste: un coeficiente positivo sube la probabilidad de incumplir en cada período y uno negativo la baja; los términos de período son el nivel base de cada uno, y el error estándar y el p-valor dicen cuán distinguible de cero es cada efecto.</w:t>
+      </w:r>
+    </w:p>
+    <w:p>
+      <w:r>
+        <w:t>La provisión de este capítulo parte de esta curva tal cual, a lo largo del ciclo.</w:t>
+      </w:r>
+    </w:p>
+    <w:p>
+      <w:r>
+        <w:rPr>
+          <w:b/>
+          <w:sz w:val="18"/>
+        </w:rPr>
+        <w:t>PD acumulada por período y cartera (promedio de las operaciones)</w:t>
+      </w:r>
+    </w:p>
+    <w:tbl>
+      <w:tblPr>
+        <w:tblStyle w:val="TableGrid"/>
+        <w:tblW w:type="auto" w:w="0"/>
+        <w:tblLook w:firstColumn="1" w:firstRow="1" w:lastColumn="0" w:lastRow="0" w:noHBand="0" w:noVBand="1" w:val="04A0"/>
+      </w:tblPr>
+      <w:tblGrid>
+        <w:gridCol w:w="1234"/>
+        <w:gridCol w:w="1234"/>
+        <w:gridCol w:w="1234"/>
+        <w:gridCol w:w="1234"/>
+        <w:gridCol w:w="1234"/>
+        <w:gridCol w:w="1234"/>
+        <w:gridCol w:w="1234"/>
+      </w:tblGrid>
+      <w:tr>
+        <w:tc>
+          <w:tcPr>
+            <w:tcW w:type="dxa" w:w="1234"/>
+          </w:tcPr>
+          <w:p>
+            <w:pPr>
+              <w:jc w:val="right"/>
+            </w:pPr>
+            <w:r>
+              <w:rPr>
+                <w:b/>
+              </w:rPr>
+              <w:t>Período</w:t>
+            </w:r>
+          </w:p>
+        </w:tc>
+        <w:tc>
+          <w:tcPr>
+            <w:tcW w:type="dxa" w:w="1234"/>
+          </w:tcPr>
+          <w:p>
+            <w:r>
+              <w:rPr>
+                <w:b/>
+              </w:rPr>
+              <w:t>Plazo</w:t>
+            </w:r>
+          </w:p>
+        </w:tc>
+        <w:tc>
+          <w:tcPr>
+            <w:tcW w:type="dxa" w:w="1234"/>
+          </w:tcPr>
+          <w:p>
+            <w:pPr>
+              <w:jc w:val="right"/>
+            </w:pPr>
+            <w:r>
+              <w:rPr>
+                <w:b/>
+              </w:rPr>
+              <w:t>Comercial</w:t>
+            </w:r>
+          </w:p>
+        </w:tc>
+        <w:tc>
+          <w:tcPr>
+            <w:tcW w:type="dxa" w:w="1234"/>
+          </w:tcPr>
+          <w:p>
+            <w:pPr>
+              <w:jc w:val="right"/>
+            </w:pPr>
+            <w:r>
+              <w:rPr>
+                <w:b/>
+              </w:rPr>
+              <w:t>Consumo</w:t>
+            </w:r>
+          </w:p>
+        </w:tc>
+        <w:tc>
+          <w:tcPr>
+            <w:tcW w:type="dxa" w:w="1234"/>
+          </w:tcPr>
+          <w:p>
+            <w:pPr>
+              <w:jc w:val="right"/>
+            </w:pPr>
+            <w:r>
+              <w:rPr>
+                <w:b/>
+              </w:rPr>
+              <w:t>Hipotecario</w:t>
+            </w:r>
+          </w:p>
+        </w:tc>
+        <w:tc>
+          <w:tcPr>
+            <w:tcW w:type="dxa" w:w="1234"/>
+          </w:tcPr>
+          <w:p>
+            <w:pPr>
+              <w:jc w:val="right"/>
+            </w:pPr>
+            <w:r>
+              <w:rPr>
+                <w:b/>
+              </w:rPr>
+              <w:t>Tarjetas</w:t>
+            </w:r>
+          </w:p>
+        </w:tc>
+        <w:tc>
+          <w:tcPr>
+            <w:tcW w:type="dxa" w:w="1234"/>
+          </w:tcPr>
+          <w:p>
+            <w:pPr>
+              <w:jc w:val="right"/>
+            </w:pPr>
+            <w:r>
+              <w:rPr>
+                <w:b/>
+              </w:rPr>
+              <w:t>Toda la cartera</w:t>
+            </w:r>
+          </w:p>
+        </w:tc>
+      </w:tr>
+      <w:tr>
+        <w:tc>
+          <w:tcPr>
+            <w:tcW w:type="dxa" w:w="1234"/>
+          </w:tcPr>
+          <w:p>
+            <w:pPr>
+              <w:jc w:val="right"/>
+            </w:pPr>
+            <w:r>
+              <w:t>1</w:t>
+            </w:r>
+          </w:p>
+        </w:tc>
+        <w:tc>
+          <w:tcPr>
+            <w:tcW w:type="dxa" w:w="1234"/>
+          </w:tcPr>
+          <w:p>
+            <w:r>
+              <w:t>1 año</w:t>
+            </w:r>
+          </w:p>
+        </w:tc>
+        <w:tc>
+          <w:tcPr>
+            <w:tcW w:type="dxa" w:w="1234"/>
+          </w:tcPr>
+          <w:p>
+            <w:pPr>
+              <w:jc w:val="right"/>
+            </w:pPr>
+            <w:r>
+              <w:t>0,0638</w:t>
+            </w:r>
+          </w:p>
+        </w:tc>
+        <w:tc>
+          <w:tcPr>
+            <w:tcW w:type="dxa" w:w="1234"/>
+          </w:tcPr>
+          <w:p>
+            <w:pPr>
+              <w:jc w:val="right"/>
+            </w:pPr>
+            <w:r>
+              <w:t>0,0618</w:t>
+            </w:r>
+          </w:p>
+        </w:tc>
+        <w:tc>
+          <w:tcPr>
+            <w:tcW w:type="dxa" w:w="1234"/>
+          </w:tcPr>
+          <w:p>
+            <w:pPr>
+              <w:jc w:val="right"/>
+            </w:pPr>
+            <w:r>
+              <w:t>0,0622</w:t>
+            </w:r>
+          </w:p>
+        </w:tc>
+        <w:tc>
+          <w:tcPr>
+            <w:tcW w:type="dxa" w:w="1234"/>
+          </w:tcPr>
+          <w:p>
+            <w:pPr>
+              <w:jc w:val="right"/>
+            </w:pPr>
+            <w:r>
+              <w:t>0,0623</w:t>
+            </w:r>
+          </w:p>
+        </w:tc>
+        <w:tc>
+          <w:tcPr>
+            <w:tcW w:type="dxa" w:w="1234"/>
+          </w:tcPr>
+          <w:p>
+            <w:pPr>
+              <w:jc w:val="right"/>
+            </w:pPr>
+            <w:r>
+              <w:t>0,0623</w:t>
+            </w:r>
+          </w:p>
+        </w:tc>
+      </w:tr>
+      <w:tr>
+        <w:tc>
+          <w:tcPr>
+            <w:tcW w:type="dxa" w:w="1234"/>
+          </w:tcPr>
+          <w:p>
+            <w:pPr>
+              <w:jc w:val="right"/>
+            </w:pPr>
+            <w:r>
+              <w:t>2</w:t>
+            </w:r>
+          </w:p>
+        </w:tc>
+        <w:tc>
+          <w:tcPr>
+            <w:tcW w:type="dxa" w:w="1234"/>
+          </w:tcPr>
+          <w:p>
+            <w:r>
+              <w:t>2 años</w:t>
+            </w:r>
+          </w:p>
+        </w:tc>
+        <w:tc>
+          <w:tcPr>
+            <w:tcW w:type="dxa" w:w="1234"/>
+          </w:tcPr>
+          <w:p>
+            <w:pPr>
+              <w:jc w:val="right"/>
+            </w:pPr>
+            <w:r>
+              <w:t>0,1216</w:t>
+            </w:r>
+          </w:p>
+        </w:tc>
+        <w:tc>
+          <w:tcPr>
+            <w:tcW w:type="dxa" w:w="1234"/>
+          </w:tcPr>
+          <w:p>
+            <w:pPr>
+              <w:jc w:val="right"/>
+            </w:pPr>
+            <w:r>
+              <w:t>0,1179</w:t>
+            </w:r>
+          </w:p>
+        </w:tc>
+        <w:tc>
+          <w:tcPr>
+            <w:tcW w:type="dxa" w:w="1234"/>
+          </w:tcPr>
+          <w:p>
+            <w:pPr>
+              <w:jc w:val="right"/>
+            </w:pPr>
+            <w:r>
+              <w:t>0,1184</w:t>
+            </w:r>
+          </w:p>
+        </w:tc>
+        <w:tc>
+          <w:tcPr>
+            <w:tcW w:type="dxa" w:w="1234"/>
+          </w:tcPr>
+          <w:p>
+            <w:pPr>
+              <w:jc w:val="right"/>
+            </w:pPr>
+            <w:r>
+              <w:t>0,1189</w:t>
+            </w:r>
+          </w:p>
+        </w:tc>
+        <w:tc>
+          <w:tcPr>
+            <w:tcW w:type="dxa" w:w="1234"/>
+          </w:tcPr>
+          <w:p>
+            <w:pPr>
+              <w:jc w:val="right"/>
+            </w:pPr>
+            <w:r>
+              <w:t>0,1188</w:t>
+            </w:r>
+          </w:p>
+        </w:tc>
+      </w:tr>
+      <w:tr>
+        <w:tc>
+          <w:tcPr>
+            <w:tcW w:type="dxa" w:w="1234"/>
+          </w:tcPr>
+          <w:p>
+            <w:pPr>
+              <w:jc w:val="right"/>
+            </w:pPr>
+            <w:r>
+              <w:t>3</w:t>
+            </w:r>
+          </w:p>
+        </w:tc>
+        <w:tc>
+          <w:tcPr>
+            <w:tcW w:type="dxa" w:w="1234"/>
+          </w:tcPr>
+          <w:p>
+            <w:r>
+              <w:t>3 años</w:t>
+            </w:r>
+          </w:p>
+        </w:tc>
+        <w:tc>
+          <w:tcPr>
+            <w:tcW w:type="dxa" w:w="1234"/>
+          </w:tcPr>
+          <w:p>
+            <w:pPr>
+              <w:jc w:val="right"/>
+            </w:pPr>
+            <w:r>
+              <w:t>0,1701</w:t>
+            </w:r>
+          </w:p>
+        </w:tc>
+        <w:tc>
+          <w:tcPr>
+            <w:tcW w:type="dxa" w:w="1234"/>
+          </w:tcPr>
+          <w:p>
+            <w:pPr>
+              <w:jc w:val="right"/>
+            </w:pPr>
+            <w:r>
+              <w:t>0,1648</w:t>
+            </w:r>
+          </w:p>
+        </w:tc>
+        <w:tc>
+          <w:tcPr>
+            <w:tcW w:type="dxa" w:w="1234"/>
+          </w:tcPr>
+          <w:p>
+            <w:pPr>
+              <w:jc w:val="right"/>
+            </w:pPr>
+            <w:r>
+              <w:t>0,1654</w:t>
+            </w:r>
+          </w:p>
+        </w:tc>
+        <w:tc>
+          <w:tcPr>
+            <w:tcW w:type="dxa" w:w="1234"/>
+          </w:tcPr>
+          <w:p>
+            <w:pPr>
+              <w:jc w:val="right"/>
+            </w:pPr>
+            <w:r>
+              <w:t>0,1663</w:t>
+            </w:r>
+          </w:p>
+        </w:tc>
+        <w:tc>
+          <w:tcPr>
+            <w:tcW w:type="dxa" w:w="1234"/>
+          </w:tcPr>
+          <w:p>
+            <w:pPr>
+              <w:jc w:val="right"/>
+            </w:pPr>
+            <w:r>
+              <w:t>0,1661</w:t>
+            </w:r>
+          </w:p>
+        </w:tc>
+      </w:tr>
+      <w:tr>
+        <w:tc>
+          <w:tcPr>
+            <w:tcW w:type="dxa" w:w="1234"/>
+          </w:tcPr>
+          <w:p>
+            <w:pPr>
+              <w:jc w:val="right"/>
+            </w:pPr>
+            <w:r>
+              <w:t>4</w:t>
+            </w:r>
+          </w:p>
+        </w:tc>
+        <w:tc>
+          <w:tcPr>
+            <w:tcW w:type="dxa" w:w="1234"/>
+          </w:tcPr>
+          <w:p>
+            <w:r>
+              <w:t>4 años</w:t>
+            </w:r>
+          </w:p>
+        </w:tc>
+        <w:tc>
+          <w:tcPr>
+            <w:tcW w:type="dxa" w:w="1234"/>
+          </w:tcPr>
+          <w:p>
+            <w:pPr>
+              <w:jc w:val="right"/>
+            </w:pPr>
+            <w:r>
+              <w:t>0,2158</w:t>
+            </w:r>
+          </w:p>
+        </w:tc>
+        <w:tc>
+          <w:tcPr>
+            <w:tcW w:type="dxa" w:w="1234"/>
+          </w:tcPr>
+          <w:p>
+            <w:pPr>
+              <w:jc w:val="right"/>
+            </w:pPr>
+            <w:r>
+              <w:t>0,2093</w:t>
+            </w:r>
+          </w:p>
+        </w:tc>
+        <w:tc>
+          <w:tcPr>
+            <w:tcW w:type="dxa" w:w="1234"/>
+          </w:tcPr>
+          <w:p>
+            <w:pPr>
+              <w:jc w:val="right"/>
+            </w:pPr>
+            <w:r>
+              <w:t>0,2099</w:t>
+            </w:r>
+          </w:p>
+        </w:tc>
+        <w:tc>
+          <w:tcPr>
+            <w:tcW w:type="dxa" w:w="1234"/>
+          </w:tcPr>
+          <w:p>
+            <w:pPr>
+              <w:jc w:val="right"/>
+            </w:pPr>
+            <w:r>
+              <w:t>0,2112</w:t>
+            </w:r>
+          </w:p>
+        </w:tc>
+        <w:tc>
+          <w:tcPr>
+            <w:tcW w:type="dxa" w:w="1234"/>
+          </w:tcPr>
+          <w:p>
+            <w:pPr>
+              <w:jc w:val="right"/>
+            </w:pPr>
+            <w:r>
+              <w:t>0,2109</w:t>
+            </w:r>
+          </w:p>
+        </w:tc>
+      </w:tr>
+      <w:tr>
+        <w:tc>
+          <w:tcPr>
+            <w:tcW w:type="dxa" w:w="1234"/>
+          </w:tcPr>
+          <w:p>
+            <w:pPr>
+              <w:jc w:val="right"/>
+            </w:pPr>
+            <w:r>
+              <w:t>5</w:t>
+            </w:r>
+          </w:p>
+        </w:tc>
+        <w:tc>
+          <w:tcPr>
+            <w:tcW w:type="dxa" w:w="1234"/>
+          </w:tcPr>
+          <w:p>
+            <w:r>
+              <w:t>5 años</w:t>
+            </w:r>
+          </w:p>
+        </w:tc>
+        <w:tc>
+          <w:tcPr>
+            <w:tcW w:type="dxa" w:w="1234"/>
+          </w:tcPr>
+          <w:p>
+            <w:pPr>
+              <w:jc w:val="right"/>
+            </w:pPr>
+            <w:r>
+              <w:t>0,2553</w:t>
+            </w:r>
+          </w:p>
+        </w:tc>
+        <w:tc>
+          <w:tcPr>
+            <w:tcW w:type="dxa" w:w="1234"/>
+          </w:tcPr>
+          <w:p>
+            <w:pPr>
+              <w:jc w:val="right"/>
+            </w:pPr>
+            <w:r>
+              <w:t>0,2478</w:t>
+            </w:r>
+          </w:p>
+        </w:tc>
+        <w:tc>
+          <w:tcPr>
+            <w:tcW w:type="dxa" w:w="1234"/>
+          </w:tcPr>
+          <w:p>
+            <w:pPr>
+              <w:jc w:val="right"/>
+            </w:pPr>
+            <w:r>
+              <w:t>0,2484</w:t>
+            </w:r>
+          </w:p>
+        </w:tc>
+        <w:tc>
+          <w:tcPr>
+            <w:tcW w:type="dxa" w:w="1234"/>
+          </w:tcPr>
+          <w:p>
+            <w:pPr>
+              <w:jc w:val="right"/>
+            </w:pPr>
+            <w:r>
+              <w:t>0,2501</w:t>
+            </w:r>
+          </w:p>
+        </w:tc>
+        <w:tc>
+          <w:tcPr>
+            <w:tcW w:type="dxa" w:w="1234"/>
+          </w:tcPr>
+          <w:p>
+            <w:pPr>
+              <w:jc w:val="right"/>
+            </w:pPr>
+            <w:r>
+              <w:t>0,2497</w:t>
+            </w:r>
+          </w:p>
+        </w:tc>
+      </w:tr>
+    </w:tbl>
+    <w:p>
+      <w:r>
+        <w:rPr>
+          <w:b/>
+          <w:sz w:val="18"/>
+        </w:rPr>
+        <w:t>Coeficientes de la curva de PD (supervivencia)</w:t>
+      </w:r>
+    </w:p>
+    <w:tbl>
+      <w:tblPr>
+        <w:tblStyle w:val="TableGrid"/>
+        <w:tblW w:type="auto" w:w="0"/>
+        <w:tblLook w:firstColumn="1" w:firstRow="1" w:lastColumn="0" w:lastRow="0" w:noHBand="0" w:noVBand="1" w:val="04A0"/>
+      </w:tblPr>
+      <w:tblGrid>
+        <w:gridCol w:w="2160"/>
+        <w:gridCol w:w="2160"/>
+        <w:gridCol w:w="2160"/>
+        <w:gridCol w:w="2160"/>
+      </w:tblGrid>
+      <w:tr>
+        <w:tc>
+          <w:tcPr>
+            <w:tcW w:type="dxa" w:w="2160"/>
+          </w:tcPr>
+          <w:p>
+            <w:r>
+              <w:rPr>
+                <w:b/>
+              </w:rPr>
+              <w:t>term</w:t>
+            </w:r>
+          </w:p>
+        </w:tc>
+        <w:tc>
+          <w:tcPr>
+            <w:tcW w:type="dxa" w:w="2160"/>
+          </w:tcPr>
+          <w:p>
+            <w:pPr>
+              <w:jc w:val="right"/>
+            </w:pPr>
+            <w:r>
+              <w:rPr>
+                <w:b/>
+              </w:rPr>
+              <w:t>coef</w:t>
+            </w:r>
+          </w:p>
+        </w:tc>
+        <w:tc>
+          <w:tcPr>
+            <w:tcW w:type="dxa" w:w="2160"/>
+          </w:tcPr>
+          <w:p>
+            <w:pPr>
+              <w:jc w:val="right"/>
+            </w:pPr>
+            <w:r>
+              <w:rPr>
+                <w:b/>
+              </w:rPr>
+              <w:t>std_error</w:t>
+            </w:r>
+          </w:p>
+        </w:tc>
+        <w:tc>
+          <w:tcPr>
+            <w:tcW w:type="dxa" w:w="2160"/>
+          </w:tcPr>
+          <w:p>
+            <w:pPr>
+              <w:jc w:val="right"/>
+            </w:pPr>
+            <w:r>
+              <w:rPr>
+                <w:b/>
+              </w:rPr>
+              <w:t>p_value</w:t>
+            </w:r>
+          </w:p>
+        </w:tc>
+      </w:tr>
+      <w:tr>
+        <w:tc>
+          <w:tcPr>
+            <w:tcW w:type="dxa" w:w="2160"/>
+          </w:tcPr>
+          <w:p>
+            <w:r>
+              <w:t>period_1</w:t>
+            </w:r>
+          </w:p>
+        </w:tc>
+        <w:tc>
+          <w:tcPr>
+            <w:tcW w:type="dxa" w:w="2160"/>
+          </w:tcPr>
+          <w:p>
+            <w:pPr>
+              <w:jc w:val="right"/>
+            </w:pPr>
+            <w:r>
+              <w:t>-3,4554</w:t>
+            </w:r>
+          </w:p>
+        </w:tc>
+        <w:tc>
+          <w:tcPr>
+            <w:tcW w:type="dxa" w:w="2160"/>
+          </w:tcPr>
+          <w:p>
+            <w:pPr>
+              <w:jc w:val="right"/>
+            </w:pPr>
+            <w:r>
+              <w:t>0,0991</w:t>
+            </w:r>
+          </w:p>
+        </w:tc>
+        <w:tc>
+          <w:tcPr>
+            <w:tcW w:type="dxa" w:w="2160"/>
+          </w:tcPr>
+          <w:p>
+            <w:pPr>
+              <w:jc w:val="right"/>
+            </w:pPr>
+            <w:r>
+              <w:t>&lt; 0,001</w:t>
+            </w:r>
+          </w:p>
+        </w:tc>
+      </w:tr>
+      <w:tr>
+        <w:tc>
+          <w:tcPr>
+            <w:tcW w:type="dxa" w:w="2160"/>
+          </w:tcPr>
+          <w:p>
+            <w:r>
+              <w:t>period_2</w:t>
+            </w:r>
+          </w:p>
+        </w:tc>
+        <w:tc>
+          <w:tcPr>
+            <w:tcW w:type="dxa" w:w="2160"/>
+          </w:tcPr>
+          <w:p>
+            <w:pPr>
+              <w:jc w:val="right"/>
+            </w:pPr>
+            <w:r>
+              <w:t>-3,4517</w:t>
+            </w:r>
+          </w:p>
+        </w:tc>
+        <w:tc>
+          <w:tcPr>
+            <w:tcW w:type="dxa" w:w="2160"/>
+          </w:tcPr>
+          <w:p>
+            <w:pPr>
+              <w:jc w:val="right"/>
+            </w:pPr>
+            <w:r>
+              <w:t>0,0996</w:t>
+            </w:r>
+          </w:p>
+        </w:tc>
+        <w:tc>
+          <w:tcPr>
+            <w:tcW w:type="dxa" w:w="2160"/>
+          </w:tcPr>
+          <w:p>
+            <w:pPr>
+              <w:jc w:val="right"/>
+            </w:pPr>
+            <w:r>
+              <w:t>&lt; 0,001</w:t>
+            </w:r>
+          </w:p>
+        </w:tc>
+      </w:tr>
+      <w:tr>
+        <w:tc>
+          <w:tcPr>
+            <w:tcW w:type="dxa" w:w="2160"/>
+          </w:tcPr>
+          <w:p>
+            <w:r>
+              <w:t>period_3</w:t>
+            </w:r>
+          </w:p>
+        </w:tc>
+        <w:tc>
+          <w:tcPr>
+            <w:tcW w:type="dxa" w:w="2160"/>
+          </w:tcPr>
+          <w:p>
+            <w:pPr>
+              <w:jc w:val="right"/>
+            </w:pPr>
+            <w:r>
+              <w:t>-3,5416</w:t>
+            </w:r>
+          </w:p>
+        </w:tc>
+        <w:tc>
+          <w:tcPr>
+            <w:tcW w:type="dxa" w:w="2160"/>
+          </w:tcPr>
+          <w:p>
+            <w:pPr>
+              <w:jc w:val="right"/>
+            </w:pPr>
+            <w:r>
+              <w:t>0,1021</w:t>
+            </w:r>
+          </w:p>
+        </w:tc>
+        <w:tc>
+          <w:tcPr>
+            <w:tcW w:type="dxa" w:w="2160"/>
+          </w:tcPr>
+          <w:p>
+            <w:pPr>
+              <w:jc w:val="right"/>
+            </w:pPr>
+            <w:r>
+              <w:t>&lt; 0,001</w:t>
+            </w:r>
+          </w:p>
+        </w:tc>
+      </w:tr>
+      <w:tr>
+        <w:tc>
+          <w:tcPr>
+            <w:tcW w:type="dxa" w:w="2160"/>
+          </w:tcPr>
+          <w:p>
+            <w:r>
+              <w:t>period_4</w:t>
+            </w:r>
+          </w:p>
+        </w:tc>
+        <w:tc>
+          <w:tcPr>
+            <w:tcW w:type="dxa" w:w="2160"/>
+          </w:tcPr>
+          <w:p>
+            <w:pPr>
+              <w:jc w:val="right"/>
+            </w:pPr>
+            <w:r>
+              <w:t>-3,5137</w:t>
+            </w:r>
+          </w:p>
+        </w:tc>
+        <w:tc>
+          <w:tcPr>
+            <w:tcW w:type="dxa" w:w="2160"/>
+          </w:tcPr>
+          <w:p>
+            <w:pPr>
+              <w:jc w:val="right"/>
+            </w:pPr>
+            <w:r>
+              <w:t>0,1026</w:t>
+            </w:r>
+          </w:p>
+        </w:tc>
+        <w:tc>
+          <w:tcPr>
+            <w:tcW w:type="dxa" w:w="2160"/>
+          </w:tcPr>
+          <w:p>
+            <w:pPr>
+              <w:jc w:val="right"/>
+            </w:pPr>
+            <w:r>
+              <w:t>&lt; 0,001</w:t>
+            </w:r>
+          </w:p>
+        </w:tc>
+      </w:tr>
+      <w:tr>
+        <w:tc>
+          <w:tcPr>
+            <w:tcW w:type="dxa" w:w="2160"/>
+          </w:tcPr>
+          <w:p>
+            <w:r>
+              <w:t>period_5</w:t>
+            </w:r>
+          </w:p>
+        </w:tc>
+        <w:tc>
+          <w:tcPr>
+            <w:tcW w:type="dxa" w:w="2160"/>
+          </w:tcPr>
+          <w:p>
+            <w:pPr>
+              <w:jc w:val="right"/>
+            </w:pPr>
+            <w:r>
+              <w:t>-3,5858</w:t>
+            </w:r>
+          </w:p>
+        </w:tc>
+        <w:tc>
+          <w:tcPr>
+            <w:tcW w:type="dxa" w:w="2160"/>
+          </w:tcPr>
+          <w:p>
+            <w:pPr>
+              <w:jc w:val="right"/>
+            </w:pPr>
+            <w:r>
+              <w:t>0,1051</w:t>
+            </w:r>
+          </w:p>
+        </w:tc>
+        <w:tc>
+          <w:tcPr>
+            <w:tcW w:type="dxa" w:w="2160"/>
+          </w:tcPr>
+          <w:p>
+            <w:pPr>
+              <w:jc w:val="right"/>
+            </w:pPr>
+            <w:r>
+              <w:t>&lt; 0,001</w:t>
+            </w:r>
+          </w:p>
+        </w:tc>
+      </w:tr>
+      <w:tr>
+        <w:tc>
+          <w:tcPr>
+            <w:tcW w:type="dxa" w:w="2160"/>
+          </w:tcPr>
+          <w:p>
+            <w:r>
+              <w:t>days_past_due</w:t>
+            </w:r>
+          </w:p>
+        </w:tc>
+        <w:tc>
+          <w:tcPr>
+            <w:tcW w:type="dxa" w:w="2160"/>
+          </w:tcPr>
+          <w:p>
+            <w:pPr>
+              <w:jc w:val="right"/>
+            </w:pPr>
+            <w:r>
+              <w:t>0,0063</w:t>
+            </w:r>
+          </w:p>
+        </w:tc>
+        <w:tc>
+          <w:tcPr>
+            <w:tcW w:type="dxa" w:w="2160"/>
+          </w:tcPr>
+          <w:p>
+            <w:pPr>
+              <w:jc w:val="right"/>
+            </w:pPr>
+            <w:r>
+              <w:t>0,00071</w:t>
+            </w:r>
+          </w:p>
+        </w:tc>
+        <w:tc>
+          <w:tcPr>
+            <w:tcW w:type="dxa" w:w="2160"/>
+          </w:tcPr>
+          <w:p>
+            <w:pPr>
+              <w:jc w:val="right"/>
+            </w:pPr>
+            <w:r>
+              <w:t>&lt; 0,001</w:t>
+            </w:r>
+          </w:p>
+        </w:tc>
+      </w:tr>
+      <w:tr>
+        <w:tc>
+          <w:tcPr>
+            <w:tcW w:type="dxa" w:w="2160"/>
+          </w:tcPr>
+          <w:p>
+            <w:r>
+              <w:t>utilizacion_linea</w:t>
+            </w:r>
+          </w:p>
+        </w:tc>
+        <w:tc>
+          <w:tcPr>
+            <w:tcW w:type="dxa" w:w="2160"/>
+          </w:tcPr>
+          <w:p>
+            <w:pPr>
+              <w:jc w:val="right"/>
+            </w:pPr>
+            <w:r>
+              <w:t>0,9536</w:t>
+            </w:r>
+          </w:p>
+        </w:tc>
+        <w:tc>
+          <w:tcPr>
+            <w:tcW w:type="dxa" w:w="2160"/>
+          </w:tcPr>
+          <w:p>
+            <w:pPr>
+              <w:jc w:val="right"/>
+            </w:pPr>
+            <w:r>
+              <w:t>0,1378</w:t>
+            </w:r>
+          </w:p>
+        </w:tc>
+        <w:tc>
+          <w:tcPr>
+            <w:tcW w:type="dxa" w:w="2160"/>
+          </w:tcPr>
+          <w:p>
+            <w:pPr>
+              <w:jc w:val="right"/>
+            </w:pPr>
+            <w:r>
+              <w:t>&lt; 0,001</w:t>
+            </w:r>
+          </w:p>
+        </w:tc>
+      </w:tr>
+      <w:tr>
+        <w:tc>
+          <w:tcPr>
+            <w:tcW w:type="dxa" w:w="2160"/>
+          </w:tcPr>
+          <w:p>
+            <w:r>
+              <w:t>deuda_ingreso</w:t>
+            </w:r>
+          </w:p>
+        </w:tc>
+        <w:tc>
+          <w:tcPr>
+            <w:tcW w:type="dxa" w:w="2160"/>
+          </w:tcPr>
+          <w:p>
+            <w:pPr>
+              <w:jc w:val="right"/>
+            </w:pPr>
+            <w:r>
+              <w:t>1,40196</w:t>
+            </w:r>
+          </w:p>
+        </w:tc>
+        <w:tc>
+          <w:tcPr>
+            <w:tcW w:type="dxa" w:w="2160"/>
+          </w:tcPr>
+          <w:p>
+            <w:pPr>
+              <w:jc w:val="right"/>
+            </w:pPr>
+            <w:r>
+              <w:t>0,0987</w:t>
+            </w:r>
+          </w:p>
+        </w:tc>
+        <w:tc>
+          <w:tcPr>
+            <w:tcW w:type="dxa" w:w="2160"/>
+          </w:tcPr>
+          <w:p>
+            <w:pPr>
+              <w:jc w:val="right"/>
+            </w:pPr>
+            <w:r>
+              <w:t>&lt; 0,001</w:t>
+            </w:r>
+          </w:p>
+        </w:tc>
+      </w:tr>
+      <w:tr>
+        <w:tc>
+          <w:tcPr>
+            <w:tcW w:type="dxa" w:w="2160"/>
+          </w:tcPr>
+          <w:p>
+            <w:r>
+              <w:t>antiguedad_meses</w:t>
+            </w:r>
+          </w:p>
+        </w:tc>
+        <w:tc>
+          <w:tcPr>
+            <w:tcW w:type="dxa" w:w="2160"/>
+          </w:tcPr>
+          <w:p>
+            <w:pPr>
+              <w:jc w:val="right"/>
+            </w:pPr>
+            <w:r>
+              <w:t>-0,0061</w:t>
+            </w:r>
+          </w:p>
+        </w:tc>
+        <w:tc>
+          <w:tcPr>
+            <w:tcW w:type="dxa" w:w="2160"/>
+          </w:tcPr>
+          <w:p>
+            <w:pPr>
+              <w:jc w:val="right"/>
+            </w:pPr>
+            <w:r>
+              <w:t>0,00079</w:t>
+            </w:r>
+          </w:p>
+        </w:tc>
+        <w:tc>
+          <w:tcPr>
+            <w:tcW w:type="dxa" w:w="2160"/>
+          </w:tcPr>
+          <w:p>
+            <w:pPr>
+              <w:jc w:val="right"/>
+            </w:pPr>
+            <w:r>
+              <w:t>&lt; 0,001</w:t>
+            </w:r>
+          </w:p>
+        </w:tc>
+      </w:tr>
+    </w:tbl>
+    <w:p>
+      <w:pPr>
+        <w:pStyle w:val="Heading2"/>
+      </w:pPr>
+      <w:r>
+        <w:t>4.2 Pérdida crediticia esperada (ECL) por etapas</w:t>
       </w:r>
     </w:p>
     <w:p>
@@ -2632,7 +4259,7 @@
         <w:rPr>
           <w:rFonts w:ascii="Consolas" w:hAnsi="Consolas"/>
         </w:rPr>
-        <w:t>2026-10-02T12:52:55.310086Z</w:t>
+        <w:t>2026-10-05T15:48:00.942816Z</w:t>
       </w:r>
     </w:p>
     <w:p>
@@ -2696,7 +4323,7 @@
         <w:rPr>
           <w:rFonts w:ascii="Consolas" w:hAnsi="Consolas"/>
         </w:rPr>
-        <w:t>2b2d47fa00aa10d36859b3e8237c7130e8562321</w:t>
+        <w:t>0efa603d6fce982384e60585fcf7c8781a77e82f</w:t>
       </w:r>
     </w:p>
     <w:p>
@@ -2716,7 +4343,7 @@
         <w:br/>
         <w:t xml:space="preserve">  "PyYAML": "6.0.3",</w:t>
         <w:br/>
-        <w:t xml:space="preserve">  "bayesrisk": "2.3.0",</w:t>
+        <w:t xml:space="preserve">  "bayesrisk": "2.5.0",</w:t>
         <w:br/>
         <w:t xml:space="preserve">  "numpy": "2.4.6",</w:t>
         <w:br/>
@@ -2756,7 +4383,7 @@
         <w:rPr>
           <w:rFonts w:ascii="Consolas" w:hAnsi="Consolas"/>
         </w:rPr>
-        <w:t>8d799329fd48f0ba66650fc4270a7196d853de05b08fc6554722a1ff42240b4d</w:t>
+        <w:t>4aafc33ab633a7f7e34a8a69197d56c1ce3fb5edc22e6e9a473a92e0ceef1a32</w:t>
       </w:r>
     </w:p>
     <w:p>
@@ -2845,11 +4472,15 @@
         <w:br/>
         <w:t xml:space="preserve">  "provisioning_ifrs9.summary",</w:t>
         <w:br/>
+        <w:t xml:space="preserve">  "survival.coefficients",</w:t>
+        <w:br/>
         <w:t xml:space="preserve">  "data.states",</w:t>
         <w:br/>
         <w:t xml:space="preserve">  "data.partitions",</w:t>
         <w:br/>
-        <w:t xml:space="preserve">  "data.exclusions"</w:t>
+        <w:t xml:space="preserve">  "data.exclusions",</w:t>
+        <w:br/>
+        <w:t xml:space="preserve">  "survival.pd_by_period"</w:t>
         <w:br/>
         <w:t>]</w:t>
       </w:r>

</xml_diff>

<commit_message>
release(2.6.0): recaptura de la demo (37507027430)
Fixtures de la demo recapturados con bayesrisk 2.6.0 desde 3a195fd
(git_dirty=false): F4 firma a3b7cf9b… con ECL 4.786.739 (Stage 3 = LGD ×
EAD) y su informe dice «Stage 3: la pérdida del incumplimiento ya
ocurrido, LGD × EAD (PD = 1)»; F1 sólo cambia en el lineage (1063d6cf…).
Firmas regeneradas; check_demo_report_copy y check:demo-bundle verdes; los
run_id que deploy.yml busca en vivo pasan a 13c5d068… (F1) y 7104f31e…
(IFRS 9); demo.test.ts con el hash, la ECL y la cobertura nuevos; vitest
941. El primer intento (37506642848) cayó en la guarda de cobertura del
capturador, corregida en 3a195fd.

Co-Authored-By: Claude Opus 5.5 <noreply@anthropic.com>
</commit_message>
<xml_diff>
--- a/web/src/fixtures/demo/report-ifrs9.docx
+++ b/web/src/fixtures/demo/report-ifrs9.docx
@@ -163,7 +163,7 @@
           </w:tcPr>
           <w:p>
             <w:r>
-              <w:t>2026-10-05</w:t>
+              <w:t>2026-10-06</w:t>
             </w:r>
           </w:p>
         </w:tc>
@@ -183,7 +183,7 @@
         <w:rPr>
           <w:rFonts w:ascii="Consolas" w:hAnsi="Consolas"/>
         </w:rPr>
-        <w:t>config_hash=013e69dc4c96e03ee87e9f3f54bcf5e1f6e6fd56b5a1b1ffdd5bf021093360b6</w:t>
+        <w:t>config_hash=a3b7cf9b485cb194807b94017915ddc76df2fd7680aeb79bd501a03c05320ee9</w:t>
       </w:r>
     </w:p>
     <w:p>
@@ -199,7 +199,7 @@
         <w:rPr>
           <w:rFonts w:ascii="Consolas" w:hAnsi="Consolas"/>
         </w:rPr>
-        <w:t>git_sha=0efa603d6fce982384e60585fcf7c8781a77e82f</w:t>
+        <w:t>git_sha=3a195fdaa421937dbbefaadd4147a0f124407936</w:t>
       </w:r>
     </w:p>
     <w:p>
@@ -461,6 +461,14 @@
         <w:pStyle w:val="ListBullet"/>
       </w:pPr>
       <w:r>
+        <w:t>Stage 3: la pérdida del incumplimiento ya ocurrido, LGD × EAD (PD = 1)</w:t>
+      </w:r>
+    </w:p>
+    <w:p>
+      <w:pPr>
+        <w:pStyle w:val="ListBullet"/>
+      </w:pPr>
+      <w:r>
         <w:t>La exposición (EAD) se proyectó constante a lo largo de la vida de cada operación, porque el dataset no trae un perfil de exposición por período: si la cartera amortiza, la ECL de por vida queda sobrestimada</w:t>
       </w:r>
     </w:p>
@@ -536,7 +544,7 @@
           </w:tcPr>
           <w:p>
             <w:r>
-              <w:t>3.423.116</w:t>
+              <w:t>4.786.739</w:t>
             </w:r>
           </w:p>
         </w:tc>
@@ -558,7 +566,7 @@
           </w:tcPr>
           <w:p>
             <w:r>
-              <w:t>2,99 %</w:t>
+              <w:t>4,19 %</w:t>
             </w:r>
           </w:p>
         </w:tc>
@@ -602,7 +610,7 @@
           </w:tcPr>
           <w:p>
             <w:r>
-              <w:t>54,09 %</w:t>
+              <w:t>67,17 %</w:t>
             </w:r>
           </w:p>
         </w:tc>
@@ -956,7 +964,7 @@
           </w:tcPr>
           <w:p>
             <w:r>
-              <w:t>$3.423.116</w:t>
+              <w:t>$4.786.739</w:t>
             </w:r>
           </w:p>
         </w:tc>
@@ -1040,7 +1048,7 @@
           </w:tcPr>
           <w:p>
             <w:r>
-              <w:t>2,99 %</w:t>
+              <w:t>4,19 %</w:t>
             </w:r>
           </w:p>
         </w:tc>
@@ -1754,7 +1762,7 @@
     </w:p>
     <w:p>
       <w:r>
-        <w:t>Sobre una exposición al incumplimiento (EAD) de $114.325.315, la pérdida crediticia esperada a constituir es $3.423.116, una cobertura del 2,99 %. Fecha de corte: 2025-06-30.</w:t>
+        <w:t>Sobre una exposición al incumplimiento (EAD) de $114.325.315, la pérdida crediticia esperada a constituir es $4.786.739, una cobertura del 4,19 %. Fecha de corte: 2025-06-30.</w:t>
       </w:r>
     </w:p>
     <w:p>
@@ -2935,7 +2943,7 @@
     </w:p>
     <w:p>
       <w:r>
-        <w:t>La probabilidad de incumplimiento por periodo proviene de la curva lifetime PD del modelo de supervivencia (discrete-time hazard), en modalidad through-the-cycle (TTC). La ECL de cada operación multiplica PD marginal, LGD y EAD periodo a periodo y descuenta cada pérdida al presente; Stage 1 corta el horizonte a 12 meses y Stage 2/3 lo extienden a la vida remanente.</w:t>
+        <w:t>La probabilidad de incumplimiento por periodo proviene de la curva lifetime PD del modelo de supervivencia (discrete-time hazard), en modalidad through-the-cycle (TTC). La ECL de cada operación multiplica PD marginal, LGD y EAD periodo a periodo y descuenta cada pérdida al presente; Stage 1 corta el horizonte a 12 meses y Stage 2 lo extiende a la vida remanente; Stage 3, una operación que ya incumplió, provisiona la pérdida de ese incumplimiento: su LGD por su EAD (PD = 1).</w:t>
       </w:r>
     </w:p>
     <w:p>
@@ -3338,7 +3346,7 @@
               <w:jc w:val="right"/>
             </w:pPr>
             <w:r>
-              <w:t>375.806,68</w:t>
+              <w:t>922.931,98</w:t>
             </w:r>
           </w:p>
         </w:tc>
@@ -3351,7 +3359,7 @@
               <w:jc w:val="right"/>
             </w:pPr>
             <w:r>
-              <w:t>0,1752</w:t>
+              <w:t>0,4302</w:t>
             </w:r>
           </w:p>
         </w:tc>
@@ -3599,7 +3607,7 @@
               <w:jc w:val="right"/>
             </w:pPr>
             <w:r>
-              <w:t>178.471,85</w:t>
+              <w:t>546.825,86</w:t>
             </w:r>
           </w:p>
         </w:tc>
@@ -3612,7 +3620,7 @@
               <w:jc w:val="right"/>
             </w:pPr>
             <w:r>
-              <w:t>0,1801</w:t>
+              <w:t>0,5519</w:t>
             </w:r>
           </w:p>
         </w:tc>
@@ -3860,7 +3868,7 @@
               <w:jc w:val="right"/>
             </w:pPr>
             <w:r>
-              <w:t>251.942,93</w:t>
+              <w:t>510.248,15</w:t>
             </w:r>
           </w:p>
         </w:tc>
@@ -3873,7 +3881,7 @@
               <w:jc w:val="right"/>
             </w:pPr>
             <w:r>
-              <w:t>0,1122</w:t>
+              <w:t>0,2273</w:t>
             </w:r>
           </w:p>
         </w:tc>
@@ -4121,7 +4129,7 @@
               <w:jc w:val="right"/>
             </w:pPr>
             <w:r>
-              <w:t>64.767,96</w:t>
+              <w:t>254.605,91</w:t>
             </w:r>
           </w:p>
         </w:tc>
@@ -4134,7 +4142,7 @@
               <w:jc w:val="right"/>
             </w:pPr>
             <w:r>
-              <w:t>0,1726</w:t>
+              <w:t>0,6786</w:t>
             </w:r>
           </w:p>
         </w:tc>
@@ -4243,7 +4251,7 @@
         <w:rPr>
           <w:rFonts w:ascii="Consolas" w:hAnsi="Consolas"/>
         </w:rPr>
-        <w:t>013e69dc4c96e03ee87e9f3f54bcf5e1f6e6fd56b5a1b1ffdd5bf021093360b6</w:t>
+        <w:t>a3b7cf9b485cb194807b94017915ddc76df2fd7680aeb79bd501a03c05320ee9</w:t>
       </w:r>
     </w:p>
     <w:p>
@@ -4259,7 +4267,7 @@
         <w:rPr>
           <w:rFonts w:ascii="Consolas" w:hAnsi="Consolas"/>
         </w:rPr>
-        <w:t>2026-10-05T15:48:00.942816Z</w:t>
+        <w:t>2026-10-06T17:58:31.631169Z</w:t>
       </w:r>
     </w:p>
     <w:p>
@@ -4323,7 +4331,7 @@
         <w:rPr>
           <w:rFonts w:ascii="Consolas" w:hAnsi="Consolas"/>
         </w:rPr>
-        <w:t>0efa603d6fce982384e60585fcf7c8781a77e82f</w:t>
+        <w:t>3a195fdaa421937dbbefaadd4147a0f124407936</w:t>
       </w:r>
     </w:p>
     <w:p>
@@ -4343,7 +4351,7 @@
         <w:br/>
         <w:t xml:space="preserve">  "PyYAML": "6.0.3",</w:t>
         <w:br/>
-        <w:t xml:space="preserve">  "bayesrisk": "2.5.0",</w:t>
+        <w:t xml:space="preserve">  "bayesrisk": "2.6.0",</w:t>
         <w:br/>
         <w:t xml:space="preserve">  "numpy": "2.4.6",</w:t>
         <w:br/>
@@ -4383,7 +4391,7 @@
         <w:rPr>
           <w:rFonts w:ascii="Consolas" w:hAnsi="Consolas"/>
         </w:rPr>
-        <w:t>4aafc33ab633a7f7e34a8a69197d56c1ce3fb5edc22e6e9a473a92e0ceef1a32</w:t>
+        <w:t>fd4021bb7cc1dd2998556502803469ca0371f052d2b8232291d06b76379fddf3</w:t>
       </w:r>
     </w:p>
     <w:p>
@@ -5721,7 +5729,7 @@
         <w:br/>
         <w:t xml:space="preserve">    "rounding": "none",</w:t>
         <w:br/>
-        <w:t xml:space="preserve">    "stage3_direct": false</w:t>
+        <w:t xml:space="preserve">    "stage3_direct": true</w:t>
         <w:br/>
         <w:t xml:space="preserve">  },</w:t>
         <w:br/>
@@ -5852,6 +5860,22 @@
           <w:rFonts w:ascii="Consolas" w:hAnsi="Consolas"/>
         </w:rPr>
         <w:t>6.000</w:t>
+      </w:r>
+    </w:p>
+    <w:p>
+      <w:r>
+        <w:rPr>
+          <w:b/>
+        </w:rPr>
+        <w:t>n_rows_without_exposure</w:t>
+      </w:r>
+    </w:p>
+    <w:p>
+      <w:r>
+        <w:rPr>
+          <w:rFonts w:ascii="Consolas" w:hAnsi="Consolas"/>
+        </w:rPr>
+        <w:t>0</w:t>
       </w:r>
     </w:p>
     <w:p>
@@ -6019,7 +6043,7 @@
         <w:rPr>
           <w:rFonts w:ascii="Consolas" w:hAnsi="Consolas"/>
         </w:rPr>
-        <w:t>3.423.116,12</w:t>
+        <w:t>4.786.738,599</w:t>
       </w:r>
     </w:p>
     <w:p>

</xml_diff>

<commit_message>
release(2.7.0): recaptura de la demo (37611402726)
Fixtures recapturados en Linux desde el bump 14b196a (bayesrisk 2.7.0, git_dirty=false): F4 con su
config_hash nuevo f688fce7… y la misma ECL (4.786.739); F1 sólo en el lineage. Firmas regeneradas,
check_demo_report_copy limpio, los run_id que el Deploy busca en vivo (84313a03…, 67b0907a…) y el
hash de demo.test.ts.

Co-Authored-By: Claude Opus 5.5 <noreply@anthropic.com>
</commit_message>
<xml_diff>
--- a/web/src/fixtures/demo/report-ifrs9.docx
+++ b/web/src/fixtures/demo/report-ifrs9.docx
@@ -163,7 +163,7 @@
           </w:tcPr>
           <w:p>
             <w:r>
-              <w:t>2026-10-06</w:t>
+              <w:t>2026-10-07</w:t>
             </w:r>
           </w:p>
         </w:tc>
@@ -183,7 +183,7 @@
         <w:rPr>
           <w:rFonts w:ascii="Consolas" w:hAnsi="Consolas"/>
         </w:rPr>
-        <w:t>config_hash=a3b7cf9b485cb194807b94017915ddc76df2fd7680aeb79bd501a03c05320ee9</w:t>
+        <w:t>config_hash=f688fce704ad36414a7c4e5f4e7c10e9455c9d50a0802b3f3ec90bb97ff4b9c7</w:t>
       </w:r>
     </w:p>
     <w:p>
@@ -199,7 +199,7 @@
         <w:rPr>
           <w:rFonts w:ascii="Consolas" w:hAnsi="Consolas"/>
         </w:rPr>
-        <w:t>git_sha=3a195fdaa421937dbbefaadd4147a0f124407936</w:t>
+        <w:t>git_sha=14b196aecb4ed0a3f0abb456bf8524f186ea8cdb</w:t>
       </w:r>
     </w:p>
     <w:p>
@@ -4251,7 +4251,7 @@
         <w:rPr>
           <w:rFonts w:ascii="Consolas" w:hAnsi="Consolas"/>
         </w:rPr>
-        <w:t>a3b7cf9b485cb194807b94017915ddc76df2fd7680aeb79bd501a03c05320ee9</w:t>
+        <w:t>f688fce704ad36414a7c4e5f4e7c10e9455c9d50a0802b3f3ec90bb97ff4b9c7</w:t>
       </w:r>
     </w:p>
     <w:p>
@@ -4267,7 +4267,7 @@
         <w:rPr>
           <w:rFonts w:ascii="Consolas" w:hAnsi="Consolas"/>
         </w:rPr>
-        <w:t>2026-10-06T17:58:31.631169Z</w:t>
+        <w:t>2026-10-07T11:03:43.388614Z</w:t>
       </w:r>
     </w:p>
     <w:p>
@@ -4331,7 +4331,7 @@
         <w:rPr>
           <w:rFonts w:ascii="Consolas" w:hAnsi="Consolas"/>
         </w:rPr>
-        <w:t>3a195fdaa421937dbbefaadd4147a0f124407936</w:t>
+        <w:t>14b196aecb4ed0a3f0abb456bf8524f186ea8cdb</w:t>
       </w:r>
     </w:p>
     <w:p>
@@ -4351,7 +4351,7 @@
         <w:br/>
         <w:t xml:space="preserve">  "PyYAML": "6.0.3",</w:t>
         <w:br/>
-        <w:t xml:space="preserve">  "bayesrisk": "2.6.0",</w:t>
+        <w:t xml:space="preserve">  "bayesrisk": "2.7.0",</w:t>
         <w:br/>
         <w:t xml:space="preserve">  "numpy": "2.4.6",</w:t>
         <w:br/>
@@ -4391,7 +4391,7 @@
         <w:rPr>
           <w:rFonts w:ascii="Consolas" w:hAnsi="Consolas"/>
         </w:rPr>
-        <w:t>fd4021bb7cc1dd2998556502803469ca0371f052d2b8232291d06b76379fddf3</w:t>
+        <w:t>36dc88ba430c06b7e92d168cc2ea3ac29776e37ff19052bae85bbf04f9fa4f11</w:t>
       </w:r>
     </w:p>
     <w:p>
@@ -5669,6 +5669,22 @@
         <w:rPr>
           <w:b/>
         </w:rPr>
+        <w:t>contract_dates</w:t>
+      </w:r>
+    </w:p>
+    <w:p>
+      <w:r>
+        <w:rPr>
+          <w:rFonts w:ascii="Consolas" w:hAnsi="Consolas"/>
+        </w:rPr>
+        <w:t>no</w:t>
+      </w:r>
+    </w:p>
+    <w:p>
+      <w:r>
+        <w:rPr>
+          <w:b/>
+        </w:rPr>
         <w:t>dependency_versions</w:t>
       </w:r>
     </w:p>
@@ -5684,6 +5700,54 @@
         <w:t xml:space="preserve">  "pandas": "2.3.3"</w:t>
         <w:br/>
         <w:t>}</w:t>
+      </w:r>
+    </w:p>
+    <w:p>
+      <w:r>
+        <w:rPr>
+          <w:b/>
+        </w:rPr>
+        <w:t>ead_beyond_observed_curve</w:t>
+      </w:r>
+    </w:p>
+    <w:p>
+      <w:r>
+        <w:rPr>
+          <w:rFonts w:ascii="Consolas" w:hAnsi="Consolas"/>
+        </w:rPr>
+        <w:t>—</w:t>
+      </w:r>
+    </w:p>
+    <w:p>
+      <w:r>
+        <w:rPr>
+          <w:b/>
+        </w:rPr>
+        <w:t>ead_installment_not_amortizing</w:t>
+      </w:r>
+    </w:p>
+    <w:p>
+      <w:r>
+        <w:rPr>
+          <w:rFonts w:ascii="Consolas" w:hAnsi="Consolas"/>
+        </w:rPr>
+        <w:t>0,0000</w:t>
+      </w:r>
+    </w:p>
+    <w:p>
+      <w:r>
+        <w:rPr>
+          <w:b/>
+        </w:rPr>
+        <w:t>ead_matured_with_balance</w:t>
+      </w:r>
+    </w:p>
+    <w:p>
+      <w:r>
+        <w:rPr>
+          <w:rFonts w:ascii="Consolas" w:hAnsi="Consolas"/>
+        </w:rPr>
+        <w:t>0,0000</w:t>
       </w:r>
     </w:p>
     <w:p>
@@ -5715,6 +5779,8 @@
         <w:br/>
         <w:t xml:space="preserve">    "exposure_profile_col": null,</w:t>
         <w:br/>
+        <w:t xml:space="preserve">    "installment_col": null,</w:t>
+        <w:br/>
         <w:t xml:space="preserve">    "limit_col": "credit_limit",</w:t>
         <w:br/>
         <w:t xml:space="preserve">    "method": "provided"</w:t>
@@ -5752,6 +5818,10 @@
         <w:t xml:space="preserve">    "workout_discount": "eir"</w:t>
         <w:br/>
         <w:t xml:space="preserve">  },</w:t>
+        <w:br/>
+        <w:t xml:space="preserve">  "maturity_date_col": null,</w:t>
+        <w:br/>
+        <w:t xml:space="preserve">  "origination_date_col": null,</w:t>
         <w:br/>
         <w:t xml:space="preserve">  "pd": {</w:t>
         <w:br/>
@@ -5844,6 +5914,54 @@
         <w:t xml:space="preserve">  "FALTA-DATO-IFRS-4"</w:t>
         <w:br/>
         <w:t>]</w:t>
+      </w:r>
+    </w:p>
+    <w:p>
+      <w:r>
+        <w:rPr>
+          <w:b/>
+        </w:rPr>
+        <w:t>n_amortizing</w:t>
+      </w:r>
+    </w:p>
+    <w:p>
+      <w:r>
+        <w:rPr>
+          <w:rFonts w:ascii="Consolas" w:hAnsi="Consolas"/>
+        </w:rPr>
+        <w:t>0</w:t>
+      </w:r>
+    </w:p>
+    <w:p>
+      <w:r>
+        <w:rPr>
+          <w:b/>
+        </w:rPr>
+        <w:t>n_installment_not_amortizing</w:t>
+      </w:r>
+    </w:p>
+    <w:p>
+      <w:r>
+        <w:rPr>
+          <w:rFonts w:ascii="Consolas" w:hAnsi="Consolas"/>
+        </w:rPr>
+        <w:t>0</w:t>
+      </w:r>
+    </w:p>
+    <w:p>
+      <w:r>
+        <w:rPr>
+          <w:b/>
+        </w:rPr>
+        <w:t>n_matured_with_balance</w:t>
+      </w:r>
+    </w:p>
+    <w:p>
+      <w:r>
+        <w:rPr>
+          <w:rFonts w:ascii="Consolas" w:hAnsi="Consolas"/>
+        </w:rPr>
+        <w:t>0</w:t>
       </w:r>
     </w:p>
     <w:p>
@@ -5988,6 +6106,22 @@
           <w:b/>
         </w:rPr>
         <w:t>segmentation</w:t>
+      </w:r>
+    </w:p>
+    <w:p>
+      <w:r>
+        <w:rPr>
+          <w:rFonts w:ascii="Consolas" w:hAnsi="Consolas"/>
+        </w:rPr>
+        <w:t>—</w:t>
+      </w:r>
+    </w:p>
+    <w:p>
+      <w:r>
+        <w:rPr>
+          <w:b/>
+        </w:rPr>
+        <w:t>tail_from_period</w:t>
       </w:r>
     </w:p>
     <w:p>

</xml_diff>

<commit_message>
feat(demo): recaptura de la demo con bayesrisk 2.9.0 (S39)
recapture-demo.yml 37772193871 3/3 sobre el bump 7488316 (bayesrisk 2.9.0, git_dirty=false): F4
config_hash 7de7a682… con la misma ECL, 4.786.739; F1 sólo en el lineage. Las firmas, el hash de
demo.test.ts y los run_id que el Deploy busca en vivo (664f184c… F1, db083269… IFRS 9).

Co-Authored-By: Claude Opus 5.5 <noreply@anthropic.com>
</commit_message>
<xml_diff>
--- a/web/src/fixtures/demo/report-ifrs9.docx
+++ b/web/src/fixtures/demo/report-ifrs9.docx
@@ -163,7 +163,7 @@
           </w:tcPr>
           <w:p>
             <w:r>
-              <w:t>2026-10-07</w:t>
+              <w:t>2026-10-08</w:t>
             </w:r>
           </w:p>
         </w:tc>
@@ -183,7 +183,7 @@
         <w:rPr>
           <w:rFonts w:ascii="Consolas" w:hAnsi="Consolas"/>
         </w:rPr>
-        <w:t>config_hash=f688fce704ad36414a7c4e5f4e7c10e9455c9d50a0802b3f3ec90bb97ff4b9c7</w:t>
+        <w:t>config_hash=7de7a6829e85107303df2cfb9f4d09a40513bc8ea855ed9e3214d5182e88870c</w:t>
       </w:r>
     </w:p>
     <w:p>
@@ -199,7 +199,7 @@
         <w:rPr>
           <w:rFonts w:ascii="Consolas" w:hAnsi="Consolas"/>
         </w:rPr>
-        <w:t>git_sha=14b196aecb4ed0a3f0abb456bf8524f186ea8cdb</w:t>
+        <w:t>git_sha=748831629ae12028915ffd499b11c6e47c30ff01</w:t>
       </w:r>
     </w:p>
     <w:p>
@@ -4251,7 +4251,7 @@
         <w:rPr>
           <w:rFonts w:ascii="Consolas" w:hAnsi="Consolas"/>
         </w:rPr>
-        <w:t>f688fce704ad36414a7c4e5f4e7c10e9455c9d50a0802b3f3ec90bb97ff4b9c7</w:t>
+        <w:t>7de7a6829e85107303df2cfb9f4d09a40513bc8ea855ed9e3214d5182e88870c</w:t>
       </w:r>
     </w:p>
     <w:p>
@@ -4267,7 +4267,7 @@
         <w:rPr>
           <w:rFonts w:ascii="Consolas" w:hAnsi="Consolas"/>
         </w:rPr>
-        <w:t>2026-10-07T11:03:43.388614Z</w:t>
+        <w:t>2026-10-08T11:46:58.576874Z</w:t>
       </w:r>
     </w:p>
     <w:p>
@@ -4331,7 +4331,7 @@
         <w:rPr>
           <w:rFonts w:ascii="Consolas" w:hAnsi="Consolas"/>
         </w:rPr>
-        <w:t>14b196aecb4ed0a3f0abb456bf8524f186ea8cdb</w:t>
+        <w:t>748831629ae12028915ffd499b11c6e47c30ff01</w:t>
       </w:r>
     </w:p>
     <w:p>
@@ -4351,7 +4351,7 @@
         <w:br/>
         <w:t xml:space="preserve">  "PyYAML": "6.0.3",</w:t>
         <w:br/>
-        <w:t xml:space="preserve">  "bayesrisk": "2.7.0",</w:t>
+        <w:t xml:space="preserve">  "bayesrisk": "2.9.0",</w:t>
         <w:br/>
         <w:t xml:space="preserve">  "numpy": "2.4.6",</w:t>
         <w:br/>
@@ -4391,7 +4391,7 @@
         <w:rPr>
           <w:rFonts w:ascii="Consolas" w:hAnsi="Consolas"/>
         </w:rPr>
-        <w:t>36dc88ba430c06b7e92d168cc2ea3ac29776e37ff19052bae85bbf04f9fa4f11</w:t>
+        <w:t>ca7dd4f5e0fd81523427628b015e65878e604320aa67b4b06d19c71ba9298005</w:t>
       </w:r>
     </w:p>
     <w:p>
@@ -5831,6 +5831,8 @@
         <w:br/>
         <w:t xml:space="preserve">    "max_lifetime_periods": null,</w:t>
         <w:br/>
+        <w:t xml:space="preserve">    "pd_12m_col": null,</w:t>
+        <w:br/>
         <w:t xml:space="preserve">    "pit_mode": "ttc_only",</w:t>
         <w:br/>
         <w:t xml:space="preserve">    "rho": null,</w:t>
@@ -5876,6 +5878,8 @@
         <w:t xml:space="preserve">    "low_credit_risk_exemption": false,</w:t>
         <w:br/>
         <w:t xml:space="preserve">    "notch_downgrade_threshold": null,</w:t>
+        <w:br/>
+        <w:t xml:space="preserve">    "origination_pd_12m_col": null,</w:t>
         <w:br/>
         <w:t xml:space="preserve">    "origination_pd_life_col": null,</w:t>
         <w:br/>

</xml_diff>

<commit_message>
chore: integra demo verificada y candidato 2.17.0 para revisión final
</commit_message>
<xml_diff>
--- a/web/src/fixtures/demo/report-ifrs9.docx
+++ b/web/src/fixtures/demo/report-ifrs9.docx
@@ -163,7 +163,7 @@
           </w:tcPr>
           <w:p>
             <w:r>
-              <w:t>2026-10-12</w:t>
+              <w:t>2026-10-21</w:t>
             </w:r>
           </w:p>
         </w:tc>
@@ -199,7 +199,7 @@
         <w:rPr>
           <w:rFonts w:ascii="Consolas" w:hAnsi="Consolas"/>
         </w:rPr>
-        <w:t>git_sha=267942a265a9df2fa3584001d694bce32abf7acb</w:t>
+        <w:t>git_sha=06c5ad70cbbe909c30e94456faccc79bddf71d03</w:t>
       </w:r>
     </w:p>
     <w:p>
@@ -223,6 +223,10 @@
         <w:gridCol w:w="2880"/>
       </w:tblGrid>
       <w:tr>
+        <w:trPr>
+          <w:tblHeader/>
+          <w:cantSplit/>
+        </w:trPr>
         <w:tc>
           <w:tcPr>
             <w:tcW w:type="dxa" w:w="2880"/>
@@ -264,6 +268,9 @@
         </w:tc>
       </w:tr>
       <w:tr>
+        <w:trPr>
+          <w:cantSplit/>
+        </w:trPr>
         <w:tc>
           <w:tcPr>
             <w:tcW w:type="dxa" w:w="2880"/>
@@ -292,6 +299,9 @@
         </w:tc>
       </w:tr>
       <w:tr>
+        <w:trPr>
+          <w:cantSplit/>
+        </w:trPr>
         <w:tc>
           <w:tcPr>
             <w:tcW w:type="dxa" w:w="2880"/>
@@ -320,6 +330,9 @@
         </w:tc>
       </w:tr>
       <w:tr>
+        <w:trPr>
+          <w:cantSplit/>
+        </w:trPr>
         <w:tc>
           <w:tcPr>
             <w:tcW w:type="dxa" w:w="2880"/>
@@ -500,6 +513,10 @@
         <w:gridCol w:w="4320"/>
       </w:tblGrid>
       <w:tr>
+        <w:trPr>
+          <w:tblHeader/>
+          <w:cantSplit/>
+        </w:trPr>
         <w:tc>
           <w:tcPr>
             <w:tcW w:type="dxa" w:w="4320"/>
@@ -528,6 +545,9 @@
         </w:tc>
       </w:tr>
       <w:tr>
+        <w:trPr>
+          <w:cantSplit/>
+        </w:trPr>
         <w:tc>
           <w:tcPr>
             <w:tcW w:type="dxa" w:w="4320"/>
@@ -550,6 +570,9 @@
         </w:tc>
       </w:tr>
       <w:tr>
+        <w:trPr>
+          <w:cantSplit/>
+        </w:trPr>
         <w:tc>
           <w:tcPr>
             <w:tcW w:type="dxa" w:w="4320"/>
@@ -572,6 +595,9 @@
         </w:tc>
       </w:tr>
       <w:tr>
+        <w:trPr>
+          <w:cantSplit/>
+        </w:trPr>
         <w:tc>
           <w:tcPr>
             <w:tcW w:type="dxa" w:w="4320"/>
@@ -594,6 +620,9 @@
         </w:tc>
       </w:tr>
       <w:tr>
+        <w:trPr>
+          <w:cantSplit/>
+        </w:trPr>
         <w:tc>
           <w:tcPr>
             <w:tcW w:type="dxa" w:w="4320"/>
@@ -616,6 +645,9 @@
         </w:tc>
       </w:tr>
       <w:tr>
+        <w:trPr>
+          <w:cantSplit/>
+        </w:trPr>
         <w:tc>
           <w:tcPr>
             <w:tcW w:type="dxa" w:w="4320"/>
@@ -884,6 +916,10 @@
         <w:gridCol w:w="2160"/>
       </w:tblGrid>
       <w:tr>
+        <w:trPr>
+          <w:tblHeader/>
+          <w:cantSplit/>
+        </w:trPr>
         <w:tc>
           <w:tcPr>
             <w:tcW w:type="dxa" w:w="2160"/>
@@ -938,6 +974,9 @@
         </w:tc>
       </w:tr>
       <w:tr>
+        <w:trPr>
+          <w:cantSplit/>
+        </w:trPr>
         <w:tc>
           <w:tcPr>
             <w:tcW w:type="dxa" w:w="2160"/>
@@ -980,6 +1019,9 @@
         </w:tc>
       </w:tr>
       <w:tr>
+        <w:trPr>
+          <w:cantSplit/>
+        </w:trPr>
         <w:tc>
           <w:tcPr>
             <w:tcW w:type="dxa" w:w="2160"/>
@@ -1022,6 +1064,9 @@
         </w:tc>
       </w:tr>
       <w:tr>
+        <w:trPr>
+          <w:cantSplit/>
+        </w:trPr>
         <w:tc>
           <w:tcPr>
             <w:tcW w:type="dxa" w:w="2160"/>
@@ -1064,6 +1109,9 @@
         </w:tc>
       </w:tr>
       <w:tr>
+        <w:trPr>
+          <w:cantSplit/>
+        </w:trPr>
         <w:tc>
           <w:tcPr>
             <w:tcW w:type="dxa" w:w="2160"/>
@@ -1244,6 +1292,10 @@
         <w:gridCol w:w="4320"/>
       </w:tblGrid>
       <w:tr>
+        <w:trPr>
+          <w:tblHeader/>
+          <w:cantSplit/>
+        </w:trPr>
         <w:tc>
           <w:tcPr>
             <w:tcW w:type="dxa" w:w="4320"/>
@@ -1275,6 +1327,9 @@
         </w:tc>
       </w:tr>
       <w:tr>
+        <w:trPr>
+          <w:cantSplit/>
+        </w:trPr>
         <w:tc>
           <w:tcPr>
             <w:tcW w:type="dxa" w:w="4320"/>
@@ -1300,6 +1355,9 @@
         </w:tc>
       </w:tr>
       <w:tr>
+        <w:trPr>
+          <w:cantSplit/>
+        </w:trPr>
         <w:tc>
           <w:tcPr>
             <w:tcW w:type="dxa" w:w="4320"/>
@@ -1325,6 +1383,9 @@
         </w:tc>
       </w:tr>
       <w:tr>
+        <w:trPr>
+          <w:cantSplit/>
+        </w:trPr>
         <w:tc>
           <w:tcPr>
             <w:tcW w:type="dxa" w:w="4320"/>
@@ -1350,6 +1411,9 @@
         </w:tc>
       </w:tr>
       <w:tr>
+        <w:trPr>
+          <w:cantSplit/>
+        </w:trPr>
         <w:tc>
           <w:tcPr>
             <w:tcW w:type="dxa" w:w="4320"/>
@@ -1396,6 +1460,10 @@
         <w:gridCol w:w="2880"/>
       </w:tblGrid>
       <w:tr>
+        <w:trPr>
+          <w:tblHeader/>
+          <w:cantSplit/>
+        </w:trPr>
         <w:tc>
           <w:tcPr>
             <w:tcW w:type="dxa" w:w="2880"/>
@@ -1443,6 +1511,9 @@
         </w:tc>
       </w:tr>
       <w:tr>
+        <w:trPr>
+          <w:cantSplit/>
+        </w:trPr>
         <w:tc>
           <w:tcPr>
             <w:tcW w:type="dxa" w:w="2880"/>
@@ -1481,6 +1552,9 @@
         </w:tc>
       </w:tr>
       <w:tr>
+        <w:trPr>
+          <w:cantSplit/>
+        </w:trPr>
         <w:tc>
           <w:tcPr>
             <w:tcW w:type="dxa" w:w="2880"/>
@@ -1519,6 +1593,9 @@
         </w:tc>
       </w:tr>
       <w:tr>
+        <w:trPr>
+          <w:cantSplit/>
+        </w:trPr>
         <w:tc>
           <w:tcPr>
             <w:tcW w:type="dxa" w:w="2880"/>
@@ -1557,6 +1634,9 @@
         </w:tc>
       </w:tr>
       <w:tr>
+        <w:trPr>
+          <w:cantSplit/>
+        </w:trPr>
         <w:tc>
           <w:tcPr>
             <w:tcW w:type="dxa" w:w="2880"/>
@@ -1615,6 +1695,10 @@
         <w:gridCol w:w="4320"/>
       </w:tblGrid>
       <w:tr>
+        <w:trPr>
+          <w:tblHeader/>
+          <w:cantSplit/>
+        </w:trPr>
         <w:tc>
           <w:tcPr>
             <w:tcW w:type="dxa" w:w="4320"/>
@@ -1828,6 +1912,10 @@
         <w:gridCol w:w="1234"/>
       </w:tblGrid>
       <w:tr>
+        <w:trPr>
+          <w:tblHeader/>
+          <w:cantSplit/>
+        </w:trPr>
         <w:tc>
           <w:tcPr>
             <w:tcW w:type="dxa" w:w="1234"/>
@@ -1939,6 +2027,9 @@
         </w:tc>
       </w:tr>
       <w:tr>
+        <w:trPr>
+          <w:cantSplit/>
+        </w:trPr>
         <w:tc>
           <w:tcPr>
             <w:tcW w:type="dxa" w:w="1234"/>
@@ -2029,6 +2120,9 @@
         </w:tc>
       </w:tr>
       <w:tr>
+        <w:trPr>
+          <w:cantSplit/>
+        </w:trPr>
         <w:tc>
           <w:tcPr>
             <w:tcW w:type="dxa" w:w="1234"/>
@@ -2119,6 +2213,9 @@
         </w:tc>
       </w:tr>
       <w:tr>
+        <w:trPr>
+          <w:cantSplit/>
+        </w:trPr>
         <w:tc>
           <w:tcPr>
             <w:tcW w:type="dxa" w:w="1234"/>
@@ -2209,6 +2306,9 @@
         </w:tc>
       </w:tr>
       <w:tr>
+        <w:trPr>
+          <w:cantSplit/>
+        </w:trPr>
         <w:tc>
           <w:tcPr>
             <w:tcW w:type="dxa" w:w="1234"/>
@@ -2299,6 +2399,9 @@
         </w:tc>
       </w:tr>
       <w:tr>
+        <w:trPr>
+          <w:cantSplit/>
+        </w:trPr>
         <w:tc>
           <w:tcPr>
             <w:tcW w:type="dxa" w:w="1234"/>
@@ -2411,6 +2514,10 @@
         <w:gridCol w:w="2160"/>
       </w:tblGrid>
       <w:tr>
+        <w:trPr>
+          <w:tblHeader/>
+          <w:cantSplit/>
+        </w:trPr>
         <w:tc>
           <w:tcPr>
             <w:tcW w:type="dxa" w:w="2160"/>
@@ -2474,6 +2581,9 @@
         </w:tc>
       </w:tr>
       <w:tr>
+        <w:trPr>
+          <w:cantSplit/>
+        </w:trPr>
         <w:tc>
           <w:tcPr>
             <w:tcW w:type="dxa" w:w="2160"/>
@@ -2525,6 +2635,9 @@
         </w:tc>
       </w:tr>
       <w:tr>
+        <w:trPr>
+          <w:cantSplit/>
+        </w:trPr>
         <w:tc>
           <w:tcPr>
             <w:tcW w:type="dxa" w:w="2160"/>
@@ -2576,6 +2689,9 @@
         </w:tc>
       </w:tr>
       <w:tr>
+        <w:trPr>
+          <w:cantSplit/>
+        </w:trPr>
         <w:tc>
           <w:tcPr>
             <w:tcW w:type="dxa" w:w="2160"/>
@@ -2627,6 +2743,9 @@
         </w:tc>
       </w:tr>
       <w:tr>
+        <w:trPr>
+          <w:cantSplit/>
+        </w:trPr>
         <w:tc>
           <w:tcPr>
             <w:tcW w:type="dxa" w:w="2160"/>
@@ -2678,6 +2797,9 @@
         </w:tc>
       </w:tr>
       <w:tr>
+        <w:trPr>
+          <w:cantSplit/>
+        </w:trPr>
         <w:tc>
           <w:tcPr>
             <w:tcW w:type="dxa" w:w="2160"/>
@@ -2729,6 +2851,9 @@
         </w:tc>
       </w:tr>
       <w:tr>
+        <w:trPr>
+          <w:cantSplit/>
+        </w:trPr>
         <w:tc>
           <w:tcPr>
             <w:tcW w:type="dxa" w:w="2160"/>
@@ -2780,6 +2905,9 @@
         </w:tc>
       </w:tr>
       <w:tr>
+        <w:trPr>
+          <w:cantSplit/>
+        </w:trPr>
         <w:tc>
           <w:tcPr>
             <w:tcW w:type="dxa" w:w="2160"/>
@@ -2831,6 +2959,9 @@
         </w:tc>
       </w:tr>
       <w:tr>
+        <w:trPr>
+          <w:cantSplit/>
+        </w:trPr>
         <w:tc>
           <w:tcPr>
             <w:tcW w:type="dxa" w:w="2160"/>
@@ -2882,6 +3013,9 @@
         </w:tc>
       </w:tr>
       <w:tr>
+        <w:trPr>
+          <w:cantSplit/>
+        </w:trPr>
         <w:tc>
           <w:tcPr>
             <w:tcW w:type="dxa" w:w="2160"/>
@@ -2996,6 +3130,10 @@
         <w:gridCol w:w="1234"/>
       </w:tblGrid>
       <w:tr>
+        <w:trPr>
+          <w:tblHeader/>
+          <w:cantSplit/>
+        </w:trPr>
         <w:tc>
           <w:tcPr>
             <w:tcW w:type="dxa" w:w="1234"/>
@@ -3104,6 +3242,9 @@
         </w:tc>
       </w:tr>
       <w:tr>
+        <w:trPr>
+          <w:cantSplit/>
+        </w:trPr>
         <w:tc>
           <w:tcPr>
             <w:tcW w:type="dxa" w:w="1234"/>
@@ -3191,6 +3332,9 @@
         </w:tc>
       </w:tr>
       <w:tr>
+        <w:trPr>
+          <w:cantSplit/>
+        </w:trPr>
         <w:tc>
           <w:tcPr>
             <w:tcW w:type="dxa" w:w="1234"/>
@@ -3278,6 +3422,9 @@
         </w:tc>
       </w:tr>
       <w:tr>
+        <w:trPr>
+          <w:cantSplit/>
+        </w:trPr>
         <w:tc>
           <w:tcPr>
             <w:tcW w:type="dxa" w:w="1234"/>
@@ -3365,6 +3512,9 @@
         </w:tc>
       </w:tr>
       <w:tr>
+        <w:trPr>
+          <w:cantSplit/>
+        </w:trPr>
         <w:tc>
           <w:tcPr>
             <w:tcW w:type="dxa" w:w="1234"/>
@@ -3452,6 +3602,9 @@
         </w:tc>
       </w:tr>
       <w:tr>
+        <w:trPr>
+          <w:cantSplit/>
+        </w:trPr>
         <w:tc>
           <w:tcPr>
             <w:tcW w:type="dxa" w:w="1234"/>
@@ -3539,6 +3692,9 @@
         </w:tc>
       </w:tr>
       <w:tr>
+        <w:trPr>
+          <w:cantSplit/>
+        </w:trPr>
         <w:tc>
           <w:tcPr>
             <w:tcW w:type="dxa" w:w="1234"/>
@@ -3626,6 +3782,9 @@
         </w:tc>
       </w:tr>
       <w:tr>
+        <w:trPr>
+          <w:cantSplit/>
+        </w:trPr>
         <w:tc>
           <w:tcPr>
             <w:tcW w:type="dxa" w:w="1234"/>
@@ -3713,6 +3872,9 @@
         </w:tc>
       </w:tr>
       <w:tr>
+        <w:trPr>
+          <w:cantSplit/>
+        </w:trPr>
         <w:tc>
           <w:tcPr>
             <w:tcW w:type="dxa" w:w="1234"/>
@@ -3800,6 +3962,9 @@
         </w:tc>
       </w:tr>
       <w:tr>
+        <w:trPr>
+          <w:cantSplit/>
+        </w:trPr>
         <w:tc>
           <w:tcPr>
             <w:tcW w:type="dxa" w:w="1234"/>
@@ -3887,6 +4052,9 @@
         </w:tc>
       </w:tr>
       <w:tr>
+        <w:trPr>
+          <w:cantSplit/>
+        </w:trPr>
         <w:tc>
           <w:tcPr>
             <w:tcW w:type="dxa" w:w="1234"/>
@@ -3974,6 +4142,9 @@
         </w:tc>
       </w:tr>
       <w:tr>
+        <w:trPr>
+          <w:cantSplit/>
+        </w:trPr>
         <w:tc>
           <w:tcPr>
             <w:tcW w:type="dxa" w:w="1234"/>
@@ -4061,6 +4232,9 @@
         </w:tc>
       </w:tr>
       <w:tr>
+        <w:trPr>
+          <w:cantSplit/>
+        </w:trPr>
         <w:tc>
           <w:tcPr>
             <w:tcW w:type="dxa" w:w="1234"/>
@@ -4267,7 +4441,7 @@
         <w:rPr>
           <w:rFonts w:ascii="Consolas" w:hAnsi="Consolas"/>
         </w:rPr>
-        <w:t>2026-10-12T15:47:51.214562Z</w:t>
+        <w:t>2026-10-21T15:07:35.136107Z</w:t>
       </w:r>
     </w:p>
     <w:p>
@@ -4331,7 +4505,7 @@
         <w:rPr>
           <w:rFonts w:ascii="Consolas" w:hAnsi="Consolas"/>
         </w:rPr>
-        <w:t>267942a265a9df2fa3584001d694bce32abf7acb</w:t>
+        <w:t>06c5ad70cbbe909c30e94456faccc79bddf71d03</w:t>
       </w:r>
     </w:p>
     <w:p>
@@ -4351,7 +4525,7 @@
         <w:br/>
         <w:t xml:space="preserve">  "PyYAML": "6.0.3",</w:t>
         <w:br/>
-        <w:t xml:space="preserve">  "bayesrisk": "2.12.0",</w:t>
+        <w:t xml:space="preserve">  "bayesrisk": "2.17.0",</w:t>
         <w:br/>
         <w:t xml:space="preserve">  "numpy": "2.4.6",</w:t>
         <w:br/>
@@ -4391,7 +4565,7 @@
         <w:rPr>
           <w:rFonts w:ascii="Consolas" w:hAnsi="Consolas"/>
         </w:rPr>
-        <w:t>ff5ada2a124b9ad420a8412370bace20141d0fa18f4e6d66f4920bd0b1ad2cd6</w:t>
+        <w:t>1f1e38d6b7a5fce46227d0a5615efcf41a2cfe76a98435d2a33c3b817468fc2b</w:t>
       </w:r>
     </w:p>
     <w:p>

</xml_diff>